<commit_message>
research: harden Stage-2 data and registration gates
</commit_message>
<xml_diff>
--- a/docs/working-paper/A_Share_Factor_Specification_Effects_Stage1_Manuscript.docx
+++ b/docs/working-paper/A_Share_Factor_Specification_Effects_Stage1_Manuscript.docx
@@ -691,7 +691,7 @@
     </w:p>
     <w:p>
       <w:r>
-        <w:t>The observed pilot uses a licensed local research export whose market file spans 3 January 2023 through 24 July 2026, with 3,894,242 rows and 4,735 symbols. The file is not redistributed. The receipt labels 2023–2024 as a training interval and evaluates 18 first-session monthly cross-sections from January 2025 through June 2026 with a 20-session forward horizon. Four factors and four cumulative variants yield 16 factor–variant cells. Appendix A reports all 16; no favorable cell is selected as the pilot conclusion.</w:t>
+        <w:t>The observed pilot uses a local research export described as licensed in the legacy repository record. The file is not redistributed. The already-public legacy receipt reports its file interval, row and symbol metadata, labels 2023–2024 as a training interval, and evaluates 18 first-session monthly cross-sections from January 2025 through June 2026 with a 20-session forward horizon. Four factors and four cumulative variants yield 16 factor–variant cells. Appendix A reports all 16; no favorable cell is selected as the pilot conclusion. These provider-derived hashes, metadata, and aggregates are reproduced only as facts already exposed by that legacy receipt; the new Stage-2 rights packet has not established their publication or controlled-review basis. Continued hosting or remediation requires a separate licensor or authorized institutional-administrator review.</w:t>
       </w:r>
     </w:p>
     <w:p>
@@ -1568,17 +1568,187 @@
     </w:p>
     <w:p>
       <w:r>
-        <w:t>The target population is ordinary A-shares listed on the Shanghai or Shenzhen exchanges. B-shares, funds, bonds, preferred shares, non-equity instruments, and Beijing Stock Exchange securities are outside the boundary. Historical eligibility begins on or after a security's listing date and ends after its delisting date. A final-survivor universe is retained only as a deliberately optimistic comparator. Stable permanent identifiers, or documented links across symbol changes, are required; duplicate date–symbol quote keys and duplicate effective security-master records fail closed.</w:t>
+        <w:t xml:space="preserve">The target population is ordinary A-shares listed on the Shanghai or Shenzhen exchanges. B-shares, funds, bonds, preferred shares, non-equity instruments, and Beijing Stock Exchange securities are outside the boundary. Historical point-in-time eligibility begins on or after a security's listing date and ends after its delisting date. The deliberately optimistic A0 comparator is fixed at the required quote/outcome cutoff, 31 January 2023: at each historical signal session, the security must already be listed and its </w:t>
+      </w:r>
+      <w:r>
+        <w:rPr>
+          <w:rFonts w:ascii="Courier New" w:hAnsi="Courier New"/>
+          <w:color w:val="0B2545"/>
+          <w:sz w:val="18"/>
+        </w:rPr>
+        <w:t>delistDate</w:t>
+      </w:r>
+      <w:r>
+        <w:t xml:space="preserve"> must be null or strictly after that fixed cutoff. Extraction-current status and acquisition date do not redefine terminal survival. Active and delisted status/date combinations must be internally consistent.</w:t>
       </w:r>
     </w:p>
     <w:p>
       <w:r>
-        <w:t>The historical rebalance interval is fixed at 1 January 2010 through 31 December 2022. Rolling signals may use a warm-up beginning 1 January 2009, but no warm-up observation contributes to an outcome. The rebalance date is the first common official SSE/SZSE session of each month, producing 156 target months. The final December 2022 horizon extends 20 official sessions into January 2023. That endpoint overlaps raw dates in the later pilot market file but is not a pilot factor-cell or rebalance estimate.</w:t>
+        <w:t xml:space="preserve">Quotes, stock master, and fundamentals must share the human-reviewed identifier contract </w:t>
+      </w:r>
+      <w:r>
+        <w:rPr>
+          <w:rFonts w:ascii="Courier New" w:hAnsi="Courier New"/>
+          <w:color w:val="0B2545"/>
+          <w:sz w:val="18"/>
+        </w:rPr>
+        <w:t>provider_stable_exchange_qualified_security_identifier_with_reviewed_code_change_mapping_v1</w:t>
+      </w:r>
+      <w:r>
+        <w:t xml:space="preserve">. The canonical </w:t>
+      </w:r>
+      <w:r>
+        <w:rPr>
+          <w:rFonts w:ascii="Courier New" w:hAnsi="Courier New"/>
+          <w:color w:val="0B2545"/>
+          <w:sz w:val="18"/>
+        </w:rPr>
+        <w:t>NNNNNN.SH</w:t>
+      </w:r>
+      <w:r>
+        <w:t>/</w:t>
+      </w:r>
+      <w:r>
+        <w:rPr>
+          <w:rFonts w:ascii="Courier New" w:hAnsi="Courier New"/>
+          <w:color w:val="0B2545"/>
+          <w:sz w:val="18"/>
+        </w:rPr>
+        <w:t>NNNNNN.SZ</w:t>
+      </w:r>
+      <w:r>
+        <w:t xml:space="preserve"> syntax is necessary but does not establish stable identity. A provider identifier definition and a documented mapping for every historical code change or reassignment are separately hash-bound before the input files; this is an identity-linkage requirement, not a vintage-data claim. Duplicate date–symbol quote keys and duplicate effective security-master records fail closed.</w:t>
       </w:r>
     </w:p>
     <w:p>
       <w:r>
-        <w:t xml:space="preserve">Four bound inputs are required: a daily quote panel, a historically effective security master, publication-dated fundamentals, and a common official exchange calendar. The quote panel must document adjusted close-return and corporate-action semantics, turnover-amount units, and contemporaneous ST and suspension status. The master must include delisted securities and historically valid list, delist, status, and security-type fields; board metadata is strongly preferred but is not a current executable gate. Fundamentals must preserve the provider's raw </w:t>
+        <w:t>The historical rebalance interval is fixed at 1 January 2010 through 31 December 2022. Rolling signals may use a warm-up beginning 1 January 2009, but no warm-up observation contributes to an outcome. The rebalance date is the first common official SSE/SZSE session of each month, producing 156 target months. The final December 2022 horizon extends 20 official sessions into January 2023. That endpoint overlaps raw dates in the later pilot market file but is not a pilot factor-cell or rebalance estimate.</w:t>
+      </w:r>
+    </w:p>
+    <w:p>
+      <w:r>
+        <w:t xml:space="preserve">Four bound inputs are required: a daily quote panel, a historically effective security master, publication-dated fundamentals, and a common official exchange calendar. Every quote row must retain finite positive </w:t>
+      </w:r>
+      <w:r>
+        <w:rPr>
+          <w:rFonts w:ascii="Courier New" w:hAnsi="Courier New"/>
+          <w:color w:val="0B2545"/>
+          <w:sz w:val="18"/>
+        </w:rPr>
+        <w:t>close_raw</w:t>
+      </w:r>
+      <w:r>
+        <w:t xml:space="preserve"> and </w:t>
+      </w:r>
+      <w:r>
+        <w:rPr>
+          <w:rFonts w:ascii="Courier New" w:hAnsi="Courier New"/>
+          <w:color w:val="0B2545"/>
+          <w:sz w:val="18"/>
+        </w:rPr>
+        <w:t>adjustment_factor</w:t>
+      </w:r>
+      <w:r>
+        <w:t xml:space="preserve">, use exact </w:t>
+      </w:r>
+      <w:r>
+        <w:rPr>
+          <w:rFonts w:ascii="Courier New" w:hAnsi="Courier New"/>
+          <w:color w:val="0B2545"/>
+          <w:sz w:val="18"/>
+        </w:rPr>
+        <w:t>price_adjustment_method=close_equals_close_raw_times_adjustment_factor</w:t>
+      </w:r>
+      <w:r>
+        <w:t xml:space="preserve"> and </w:t>
+      </w:r>
+      <w:r>
+        <w:rPr>
+          <w:rFonts w:ascii="Courier New" w:hAnsi="Courier New"/>
+          <w:color w:val="0B2545"/>
+          <w:sz w:val="18"/>
+        </w:rPr>
+        <w:t>price_adjustment_convention=provider_cumulative_backward_adjusted_hfq_no_rebasing</w:t>
+      </w:r>
+      <w:r>
+        <w:t xml:space="preserve">, and mechanically satisfy </w:t>
+      </w:r>
+      <w:r>
+        <w:rPr>
+          <w:rFonts w:ascii="Courier New" w:hAnsi="Courier New"/>
+          <w:color w:val="0B2545"/>
+          <w:sz w:val="18"/>
+        </w:rPr>
+        <w:t>close=close_raw×adjustment_factor</w:t>
+      </w:r>
+      <w:r>
+        <w:t xml:space="preserve"> within fixed </w:t>
+      </w:r>
+      <w:r>
+        <w:rPr>
+          <w:rFonts w:ascii="Courier New" w:hAnsi="Courier New"/>
+          <w:color w:val="0B2545"/>
+          <w:sz w:val="18"/>
+        </w:rPr>
+        <w:t>1e-12</w:t>
+      </w:r>
+      <w:r>
+        <w:t xml:space="preserve"> relative and absolute tolerances. The cumulative factor is used as delivered without rebasing; per-symbol positive constant rescaling leaves return ratios unchanged, and cross-sectional price levels are not estimands. A human review separately binds evidence hashes for the provider raw-close/valuation definition, adjustment-factor convention, and normalization or adapter record. Every quote row must also carry </w:t>
+      </w:r>
+      <w:r>
+        <w:rPr>
+          <w:rFonts w:ascii="Courier New" w:hAnsi="Courier New"/>
+          <w:color w:val="0B2545"/>
+          <w:sz w:val="18"/>
+        </w:rPr>
+        <w:t>close_observation_type</w:t>
+      </w:r>
+      <w:r>
+        <w:t xml:space="preserve">: exactly </w:t>
+      </w:r>
+      <w:r>
+        <w:rPr>
+          <w:rFonts w:ascii="Courier New" w:hAnsi="Courier New"/>
+          <w:color w:val="0B2545"/>
+          <w:sz w:val="18"/>
+        </w:rPr>
+        <w:t>traded_close</w:t>
+      </w:r>
+      <w:r>
+        <w:t xml:space="preserve"> when </w:t>
+      </w:r>
+      <w:r>
+        <w:rPr>
+          <w:rFonts w:ascii="Courier New" w:hAnsi="Courier New"/>
+          <w:color w:val="0B2545"/>
+          <w:sz w:val="18"/>
+        </w:rPr>
+        <w:t>is_suspended=false</w:t>
+      </w:r>
+      <w:r>
+        <w:t xml:space="preserve"> and exactly </w:t>
+      </w:r>
+      <w:r>
+        <w:rPr>
+          <w:rFonts w:ascii="Courier New" w:hAnsi="Courier New"/>
+          <w:color w:val="0B2545"/>
+          <w:sz w:val="18"/>
+        </w:rPr>
+        <w:t>suspension_valuation</w:t>
+      </w:r>
+      <w:r>
+        <w:t xml:space="preserve"> when </w:t>
+      </w:r>
+      <w:r>
+        <w:rPr>
+          <w:rFonts w:ascii="Courier New" w:hAnsi="Courier New"/>
+          <w:color w:val="0B2545"/>
+          <w:sz w:val="18"/>
+        </w:rPr>
+        <w:t>is_suspended=true</w:t>
+      </w:r>
+      <w:r>
+        <w:t xml:space="preserve">. Provider evidence must establish that a suspension valuation was recorded or published for that exact official session; the research code may not manufacture one by forward-filling a last price. The panel must also document turnover-amount units and contemporaneous ST and suspension status. The master must include delisted securities and historically valid list, delist, status, and security-type fields; board metadata is strongly preferred but is not a current executable gate. Fundamentals must preserve the provider's raw </w:t>
       </w:r>
       <w:r>
         <w:rPr>
@@ -1629,12 +1799,12 @@
     </w:p>
     <w:p>
       <w:r>
-        <w:t>The four fixed signals are ROE; adjusted-close momentum over 60 official sessions; the negative standard deviation of adjusted daily returns over 20 official sessions; and a complete-case composite equal to 0.50 times the ROE percentile rank, plus 0.30 times momentum rank, plus 0.20 times low-volatility rank. The weights are not re-estimated. Missing signals are not imputed. Industry neutralization, size residualization, alternative lookbacks, reconstructed ROE, and raw-ratio regressions are outside the claim set.</w:t>
+        <w:t>The four fixed signals are ROE; provider close-observation momentum over 60 official sessions; the negative standard deviation of daily valuation returns over 20 official sessions; and a complete-case composite equal to 0.50 times the ROE percentile rank, plus 0.30 times momentum rank, plus 0.20 times low-volatility rank. The weights are not re-estimated. Missing signals are not imputed. Industry neutralization, size residualization, alternative lookbacks, reconstructed ROE, and raw-ratio regressions are outside the claim set.</w:t>
       </w:r>
     </w:p>
     <w:p>
       <w:r>
-        <w:t xml:space="preserve">The no-lag outcome is adjusted close at official session </w:t>
+        <w:t xml:space="preserve">The no-lag outcome is the provider close observation at official session </w:t>
       </w:r>
       <w:r>
         <w:rPr>
@@ -1645,7 +1815,7 @@
         <w:t>t+20</w:t>
       </w:r>
       <w:r>
-        <w:t xml:space="preserve"> divided by adjusted close at signal session </w:t>
+        <w:t xml:space="preserve"> divided by that at signal session </w:t>
       </w:r>
       <w:r>
         <w:rPr>
@@ -1656,7 +1826,7 @@
         <w:t>t</w:t>
       </w:r>
       <w:r>
-        <w:t xml:space="preserve">, minus one. The lagged outcome is adjusted close at </w:t>
+        <w:t xml:space="preserve">, minus one. The lagged outcome is the provider close observation at </w:t>
       </w:r>
       <w:r>
         <w:rPr>
@@ -1667,7 +1837,7 @@
         <w:t>t+21</w:t>
       </w:r>
       <w:r>
-        <w:t xml:space="preserve"> divided by adjusted close at </w:t>
+        <w:t xml:space="preserve"> divided by that at </w:t>
       </w:r>
       <w:r>
         <w:rPr>
@@ -1678,12 +1848,67 @@
         <w:t>t+1</w:t>
       </w:r>
       <w:r>
-        <w:t>, minus one. The signal-session quote is already present for every cross-section candidate; the required forward exit, lagged entry, and lagged exit must then exist for every signal-eligible security. The code may not chase that security's next observed quote, carry forward its last price, substitute a default return or recovery, or silently omit the security. A missing forward exit, lagged entry, or lagged exit receives one of three mutually exclusive reason codes and makes that factor–variant–month cell non-estimable. A non-finite quote or return is an input-integrity failure, not a fourth endpoint reason.</w:t>
+        <w:t xml:space="preserve">, minus one. Each cross-section candidate belongs to the lifecycle-eligible strict A-share master and has an exact signal-session close observation. Before design freeze, every member of </w:t>
+      </w:r>
+      <w:r>
+        <w:rPr>
+          <w:rFonts w:ascii="Courier New" w:hAnsi="Courier New"/>
+          <w:color w:val="0B2545"/>
+          <w:sz w:val="18"/>
+        </w:rPr>
+        <w:t>active master ∩ signal-session quote identifiers</w:t>
+      </w:r>
+      <w:r>
+        <w:t xml:space="preserve"> must have exact rows at </w:t>
+      </w:r>
+      <w:r>
+        <w:rPr>
+          <w:rFonts w:ascii="Courier New" w:hAnsi="Courier New"/>
+          <w:color w:val="0B2545"/>
+          <w:sz w:val="18"/>
+        </w:rPr>
+        <w:t>t</w:t>
+      </w:r>
+      <w:r>
+        <w:t xml:space="preserve">, </w:t>
+      </w:r>
+      <w:r>
+        <w:rPr>
+          <w:rFonts w:ascii="Courier New" w:hAnsi="Courier New"/>
+          <w:color w:val="0B2545"/>
+          <w:sz w:val="18"/>
+        </w:rPr>
+        <w:t>t+1</w:t>
+      </w:r>
+      <w:r>
+        <w:t xml:space="preserve">, </w:t>
+      </w:r>
+      <w:r>
+        <w:rPr>
+          <w:rFonts w:ascii="Courier New" w:hAnsi="Courier New"/>
+          <w:color w:val="0B2545"/>
+          <w:sz w:val="18"/>
+        </w:rPr>
+        <w:t>t+20</w:t>
+      </w:r>
+      <w:r>
+        <w:t xml:space="preserve">, and </w:t>
+      </w:r>
+      <w:r>
+        <w:rPr>
+          <w:rFonts w:ascii="Courier New" w:hAnsi="Courier New"/>
+          <w:color w:val="0B2545"/>
+          <w:sz w:val="18"/>
+        </w:rPr>
+        <w:t>t+21</w:t>
+      </w:r>
+      <w:r>
+        <w:t>, so the exact-endpoint count equals the candidate count in every month; the separate minimum of 1,000 complete quote contracts remains. Both traded closes and supplier-recorded suspension valuations must occur among the signal-session candidates. The code may not chase a security's next observed quote, use a reopening quote, forward-fill its last price, substitute a default return or recovery, or silently omit the security. A missing forward exit, lagged entry, or lagged exit receives one of three mutually exclusive reason codes and makes that factor–variant–month cell non-estimable. A non-finite close observation or valuation return is an input-integrity failure, not a fourth endpoint reason.</w:t>
       </w:r>
     </w:p>
     <w:p>
       <w:r>
-        <w:t xml:space="preserve">This exact-only rule applies equally to securities that delist, remain suspended, change identifiers, or have an unexplained quote gap within the horizon. An independently documented terminal return can qualify only if the bound quote product represents it as the exact required endpoint under the declared total-return semantics; an analyst-created delisting payoff does not. Because the design requires every one of the 72 factor–variant cells in every one of the 156 months, any unresolved endpoint that makes a required cell non-estimable leads to the global status </w:t>
+        <w:t xml:space="preserve">This exact-only rule applies equally to securities that delist, change identifiers, or have an unexplained quote gap within the horizon. A suspended session is resolved only by an attested supplier-recorded or published same-session valuation; that valuation is not an executable fill. An independently documented terminal return can qualify only if the bound quote product represents it as the exact required endpoint under the declared total-return semantics; an analyst-created delisting payoff does not. Because the design requires every one of the 72 factor–variant cells in every one of the 156 months, any unresolved endpoint that makes a required cell non-estimable leads to the global status </w:t>
       </w:r>
       <w:r>
         <w:rPr>
@@ -1699,7 +1924,29 @@
     </w:p>
     <w:p>
       <w:r>
-        <w:t>For continuity with the pilot, each estimable cell also reports the equal-weight top signal quintile return minus the equal-weight universe mean. It is neither self-financing nor cost adjusted and cannot support an implementability claim. Candidate, signal-missing, signal-eligible, exact-resolved, and unresolved counts are reported for every monthly cell. The runner constructs one endpoint-resolution record per signal-eligible key and binds its hash and aggregate reason counts in the public receipt. Public-only verification checks the receipt's structure and integrity but cannot inspect the withheld ledger. In a controlled audit, an authorized verifier supplied with the private ledger additionally checks its hash, canonical order, uniqueness, aggregate counts, and per-cell cardinality against the published denominators; without licensed raw inputs it still cannot independently authenticate the underlying security identities.</w:t>
+        <w:t xml:space="preserve">For continuity with the pilot, each estimable cell also reports the equal-weight top signal quintile valuation return minus the equal-weight universe mean. The frozen grouping rule uses average percentile ranks, defines the bottom quintile as </w:t>
+      </w:r>
+      <w:r>
+        <w:rPr>
+          <w:rFonts w:ascii="Courier New" w:hAnsi="Courier New"/>
+          <w:color w:val="0B2545"/>
+          <w:sz w:val="18"/>
+        </w:rPr>
+        <w:t>rank &lt;= 0.2</w:t>
+      </w:r>
+      <w:r>
+        <w:t xml:space="preserve">, and defines the top quintile as </w:t>
+      </w:r>
+      <w:r>
+        <w:rPr>
+          <w:rFonts w:ascii="Courier New" w:hAnsi="Courier New"/>
+          <w:color w:val="0B2545"/>
+          <w:sz w:val="18"/>
+        </w:rPr>
+        <w:t>rank &gt; 0.8</w:t>
+      </w:r>
+      <w:r>
+        <w:t>. Equal signal values receive one average rank and remain together; group sizes may therefore differ from 20% when a tie spans a boundary, while 1,000 distinct values produce exactly 200 securities in each tail. The diagnostic is neither self-financing nor cost adjusted and cannot support an implementability claim. Every return and IC in this core is a valuation diagnostic, not an executable trade return. Candidate, signal-missing, signal-eligible, exact-resolved, and unresolved counts are reported for every monthly cell. The runner constructs one endpoint-resolution record per signal-eligible key and binds its hash and aggregate reason counts in the public receipt. Public-only verification checks the receipt's structure and integrity but cannot inspect the withheld ledger. In a controlled audit, an authorized verifier supplied with the private ledger additionally checks its hash, canonical order, uniqueness, aggregate counts, and per-cell cardinality against the published denominators; without licensed raw inputs it still cannot independently authenticate the underlying security identities.</w:t>
       </w:r>
     </w:p>
     <w:p>
@@ -1712,7 +1959,7 @@
     </w:p>
     <w:p>
       <w:r>
-        <w:t xml:space="preserve">Feasibility has three distinct gates. First, the externally timestamped bounded source probe requests only 12 fixed securities on two fixed dates and can establish only source-retrieval feasibility; its passing receipt is hash-bound into the later design. Second, a full outcome-blind coverage and rights review may inspect dates, identifiers, fields, semantics, rights, and aggregate counts—but not factor ICs, portfolio returns, candidate rankings, or historical outcome summaries—to establish the 2009 warm-up, all 156 target months, January 2023 quote coverage, valid and status-consistent historical list/delist records, publication-date coverage, non-degenerate trading-status fields, official calendar, field semantics, lawful aggregate disclosure, reviewer access, and custody. For each target rebalance, this review must count the same strict SH/SZ A-share identifiers across every quote session from </w:t>
+        <w:t xml:space="preserve">Feasibility has three distinct gates. First, the externally timestamped bounded source probe requests only 12 fixed securities on two fixed dates and can establish only source-retrieval feasibility; its passing receipt is hash-bound into the later design. Second, a full outcome-blind coverage and rights review may inspect dates, identifiers, fields, semantics, rights, and aggregate counts—but not factor ICs, portfolio returns, candidate rankings, or historical outcome summaries—to establish the 2009 warm-up, all 156 target months, January 2023 quote coverage, valid and status-consistent historical list/delist records, publication-date coverage, non-degenerate trading-status fields, official calendar, field semantics, lawful aggregate disclosure, reviewer access, and custody. Every quote row must pass the exact </w:t>
       </w:r>
       <w:r>
         <w:rPr>
@@ -1720,65 +1967,10 @@
           <w:color w:val="0B2545"/>
           <w:sz w:val="18"/>
         </w:rPr>
-        <w:t>t-60</w:t>
-      </w:r>
-      <w:r>
-        <w:t xml:space="preserve"> through </w:t>
-      </w:r>
-      <w:r>
-        <w:rPr>
-          <w:rFonts w:ascii="Courier New" w:hAnsi="Courier New"/>
-          <w:color w:val="0B2545"/>
-          <w:sz w:val="18"/>
-        </w:rPr>
-        <w:t>t</w:t>
-      </w:r>
-      <w:r>
-        <w:t xml:space="preserve"> for the implemented momentum history, every session from </w:t>
-      </w:r>
-      <w:r>
-        <w:rPr>
-          <w:rFonts w:ascii="Courier New" w:hAnsi="Courier New"/>
-          <w:color w:val="0B2545"/>
-          <w:sz w:val="18"/>
-        </w:rPr>
-        <w:t>t-20</w:t>
-      </w:r>
-      <w:r>
-        <w:t xml:space="preserve"> through </w:t>
-      </w:r>
-      <w:r>
-        <w:rPr>
-          <w:rFonts w:ascii="Courier New" w:hAnsi="Courier New"/>
-          <w:color w:val="0B2545"/>
-          <w:sz w:val="18"/>
-        </w:rPr>
-        <w:t>t</w:t>
-      </w:r>
-      <w:r>
-        <w:t xml:space="preserve"> for volatility, </w:t>
-      </w:r>
-      <w:r>
-        <w:rPr>
-          <w:rFonts w:ascii="Courier New" w:hAnsi="Courier New"/>
-          <w:color w:val="0B2545"/>
-          <w:sz w:val="18"/>
-        </w:rPr>
-        <w:t>t-19</w:t>
-      </w:r>
-      <w:r>
-        <w:t xml:space="preserve"> through </w:t>
-      </w:r>
-      <w:r>
-        <w:rPr>
-          <w:rFonts w:ascii="Courier New" w:hAnsi="Courier New"/>
-          <w:color w:val="0B2545"/>
-          <w:sz w:val="18"/>
-        </w:rPr>
-        <w:t>t</w:t>
-      </w:r>
-      <w:r>
-        <w:t xml:space="preserve"> for the amount mean, and </w:t>
+        <w:t>close_observation_type</w:t>
+      </w:r>
+      <w:r>
+        <w:t xml:space="preserve">/suspension mapping, both observation types must occur among signal-session candidates, and human evidence must establish supplier-recorded same-session valuation provenance. For each target rebalance, every active-master signal-session candidate must have all </w:t>
       </w:r>
       <w:r>
         <w:rPr>
@@ -1789,12 +1981,45 @@
         <w:t>t/t+1/t+20/t+21</w:t>
       </w:r>
       <w:r>
-        <w:t xml:space="preserve"> endpoints; at least 1,000 identifiers must satisfy the joint contract. File endpoints, aggregate monthly counts, and a dense rebalance date do not establish that condition. Third, only after registration and execution authorization does the runner form factor-variant signal-eligible denominators and enforce exact endpoint resolution and the private reason ledger. The pre-lock presence gate does not replace that final cell-level condition, and a bounded two-date probe cannot establish either one.</w:t>
+        <w:t xml:space="preserve"> endpoints, and at least 1,000 identifiers must additionally satisfy the full joint history-and-endpoint contract across </w:t>
+      </w:r>
+      <w:r>
+        <w:rPr>
+          <w:rFonts w:ascii="Courier New" w:hAnsi="Courier New"/>
+          <w:color w:val="0B2545"/>
+          <w:sz w:val="18"/>
+        </w:rPr>
+        <w:t>t-60..t</w:t>
+      </w:r>
+      <w:r>
+        <w:t xml:space="preserve">, </w:t>
+      </w:r>
+      <w:r>
+        <w:rPr>
+          <w:rFonts w:ascii="Courier New" w:hAnsi="Courier New"/>
+          <w:color w:val="0B2545"/>
+          <w:sz w:val="18"/>
+        </w:rPr>
+        <w:t>t-20..t</w:t>
+      </w:r>
+      <w:r>
+        <w:t xml:space="preserve">, </w:t>
+      </w:r>
+      <w:r>
+        <w:rPr>
+          <w:rFonts w:ascii="Courier New" w:hAnsi="Courier New"/>
+          <w:color w:val="0B2545"/>
+          <w:sz w:val="18"/>
+        </w:rPr>
+        <w:t>t-19..t</w:t>
+      </w:r>
+      <w:r>
+        <w:t>, and the four endpoints. File endpoints, aggregate monthly counts, and a dense rebalance date do not establish those conditions. Third, only after registration and execution authorization does the runner form factor-variant signal-eligible denominators and enforce exact endpoint resolution and the private reason ledger. The pre-lock presence gate does not replace that final cell-level condition, and a bounded two-date probe cannot establish either one.</w:t>
       </w:r>
     </w:p>
     <w:p>
       <w:r>
-        <w:t>A legacy feasibility audit has inspected schemas and aggregate coverage in the local bundle, including fundamental records from 2020Q1 through 2022. It did not assemble or view a complete 2010–2022 quote outcome panel or historical factor-return or IC series. Calendar labels do not establish blindness: final eligibility remains conditional on the signed exposure inventory, independent custody, external timestamp, and authorized release.</w:t>
+        <w:t>A legacy feasibility audit inspected schemas and aggregate coverage in locally retained material. It did not establish that any delivery passes the fixed Stage-2 interval, field, semantic, endpoint, or rights gates, and it did not assemble or view a complete 2010–2022 factor-return or IC series. Calendar labels do not establish blindness: final eligibility remains conditional on the signed exposure inventory, independent custody, external timestamp, and authorized release.</w:t>
       </w:r>
     </w:p>
     <w:tbl>
@@ -1848,7 +2073,7 @@
                 <w:color w:val="0B2545"/>
                 <w:sz w:val="18"/>
               </w:rPr>
-              <w:t xml:space="preserve"> The licensed quote bundle begins in 2023 and supplies zero target rebalances for 2010–2022. Fundamentals begin at 2020Q1. The bound historical inputs, exact endpoint evidence, official calendar, raw </w:t>
+              <w:t xml:space="preserve"> No reviewed delivery has passed the complete 2009 warm-up, 2010–2022 analysis, January 2023 endpoint, lifecycle, all-candidate exact-endpoint, official-calendar, raw-</w:t>
             </w:r>
             <w:r>
               <w:rPr>
@@ -1863,7 +2088,7 @@
                 <w:color w:val="0B2545"/>
                 <w:sz w:val="18"/>
               </w:rPr>
-              <w:t xml:space="preserve"> mapping, adjusted-return semantics, non-degenerate suspension evidence, publication rights, final exposure attestation, and external registration chain are incomplete. The historical outcome analysis remains unrun.</w:t>
+              <w:t>, recorded-publication-date, close-observation mapping, supplier-recorded suspension-valuation, signal-session non-degeneracy, publication-rights, and controlled-review gates. The final exposure attestation and external registration chain are also incomplete. The historical outcome analysis remains unrun.</w:t>
             </w:r>
           </w:p>
         </w:tc>
@@ -1951,7 +2176,18 @@
         <w:t>A0_final_report_end</w:t>
       </w:r>
       <w:r>
-        <w:t>: final-survivor universe; ROE available at report-period end;</w:t>
+        <w:t>: fixed 31 January 2023 terminal-survivor universe (</w:t>
+      </w:r>
+      <w:r>
+        <w:rPr>
+          <w:rFonts w:ascii="Courier New" w:hAnsi="Courier New"/>
+          <w:color w:val="0B2545"/>
+          <w:sz w:val="18"/>
+        </w:rPr>
+        <w:t>delistDate</w:t>
+      </w:r>
+      <w:r>
+        <w:t xml:space="preserve"> null or strictly after the cutoff, with listing required by the historical signal session); ROE available at report-period end;</w:t>
       </w:r>
     </w:p>
     <w:p>
@@ -2342,6 +2578,11 @@
       </w:r>
       <w:r>
         <w:t>, the design has 18 variants. Four factors therefore produce 72 factor–variant reporting cells; the implementation lattice itself contains 16 variants and 64 factor–variant cells.</w:t>
+      </w:r>
+    </w:p>
+    <w:p>
+      <w:r>
+        <w:t>The 18-variant, 72-cell design remains the target. If a supplier cannot prove that suspended-session values were recorded or published for the exact official session, the study remains blocked; a carried-forward research price may not be relabeled. The only possible fallback is prospective and outcome blind: before external registration, remove every suspension-component factorial variant, leaving 10 variants and 40 factor–variant cells, then re-enumerate the estimands and multiplicity family and re-freeze and externally timestamp every design artifact. No 40-cell switch is permitted after registration or outcome access.</w:t>
       </w:r>
     </w:p>
     <w:p>
@@ -4041,7 +4282,7 @@
     </w:p>
     <w:p>
       <w:r>
-        <w:t>These controls establish scope, chronology, and artifact identity; they do not prove that a data vendor is correct or that software can execute only once. Licensed rows need not be redistributed, but lawful aggregate disclosure and an authorized independent rerun or controlled reviewer access are required. Hashes identify retained bytes rather than the complete information available to investors.</w:t>
+        <w:t>These controls establish scope, chronology, and artifact identity; they do not prove that a data vendor is correct or that software can execute only once. Licensed rows are not redistributed. Because the registered public receipt discloses the reviewed source identity and exact field-mapping projection, every required dataset must separately grant source-identity publication and field-mapping citation, as well as lawful aggregate disclosure, hash publication, and an authorized independent rerun or controlled reviewer access. The private rights packet records, for each of the four dataset roles, the exact source name and complete canonical-to-provider field map that may be cited, together with a canonical projection hash; the public declaration must reproduce those four authorized projections exactly. A generic compliance statement, omitted or additional field, swapped role, hash mismatch, denial, or unresolved conditional permission is a hard stop. Private contract text, source references, signatures, and verification records are not included in the public projection. Hashes identify retained bytes rather than the complete information available to investors.</w:t>
       </w:r>
     </w:p>
     <w:p>
@@ -4685,7 +4926,7 @@
     </w:p>
     <w:p>
       <w:r>
-        <w:t>Second, the required historical data and publication rights are not secured. The exact-only endpoint rule is intentionally demanding and may make the proposed design infeasible, particularly around delistings, suspensions, and identifier changes. That outcome is scientifically preferable to silently selecting securities with convenient horizon prices. A failed coverage probe requires a newly timestamped design rather than a post-outcome relaxation.</w:t>
+        <w:t>Second, the required historical data and publication rights are not secured. The exact-only endpoint rule and supplier-recorded suspension-valuation evidence are intentionally demanding and may make the proposed design infeasible, particularly around delistings, suspensions, and identifier changes. That outcome is scientifically preferable to silently selecting securities with convenient horizon prices. Before registration only, the explicitly disclosed 40-cell suspension-off redesign may be prospectively frozen; after registration or outcome access, no such relaxation is permitted.</w:t>
       </w:r>
     </w:p>
     <w:p>
@@ -7699,7 +7940,7 @@
                 <w:color w:val="26313B"/>
                 <w:sz w:val="15"/>
               </w:rPr>
-              <w:t>Final survivors</w:t>
+              <w:t>Fixed 2023-01-31 terminal survivors</w:t>
             </w:r>
           </w:p>
         </w:tc>
@@ -9599,7 +9840,29 @@
     </w:p>
     <w:p>
       <w:r>
-        <w:t xml:space="preserve">The bounded source-probe specification must receive an external timestamp before it is run, and the later plan must bind a passing canonical probe receipt. That probe checks only its fixed two-date, 12-security retrieval scope. A separate full outcome-blind coverage and semantics review—without factor values, forward-return summaries, rankings, or ICs—must establish the 2009 warm-up, 156 target rebalances, and January 2023 quote coverage; at least 15 distinct quoted dates that belong to the official calendar in each target month; and at least 1,000 strict SH/SZ A-share identifiers per rebalance that jointly have quote rows at every session from </w:t>
+        <w:t xml:space="preserve">The bounded source-probe specification must receive an external timestamp before it is run, and the later plan must bind a passing canonical probe receipt. That probe checks only its fixed two-date, 12-security retrieval scope. A separate full outcome-blind coverage and semantics review—without factor values, forward-return summaries, rankings, or ICs—must establish the 2009 warm-up, 156 target rebalances, and January 2023 quote coverage; at least 15 distinct quoted dates that belong to the official calendar in each target month; the fixed 31 January 2023 terminal-survivor comparator; provider-stable identifier semantics shared by quotes, master, and fundamentals; a documented code-change/reassignment map; exact </w:t>
+      </w:r>
+      <w:r>
+        <w:rPr>
+          <w:rFonts w:ascii="Courier New" w:hAnsi="Courier New"/>
+          <w:color w:val="0B2545"/>
+          <w:sz w:val="18"/>
+        </w:rPr>
+        <w:t>close_observation_type</w:t>
+      </w:r>
+      <w:r>
+        <w:t xml:space="preserve">/suspension mapping; both observation types among signal-session candidates; and supplier-recorded same-session suspension-valuation provenance. In every month, every active-master signal-session candidate must have </w:t>
+      </w:r>
+      <w:r>
+        <w:rPr>
+          <w:rFonts w:ascii="Courier New" w:hAnsi="Courier New"/>
+          <w:color w:val="0B2545"/>
+          <w:sz w:val="18"/>
+        </w:rPr>
+        <w:t>t/t+1/t+20/t+21</w:t>
+      </w:r>
+      <w:r>
+        <w:t xml:space="preserve"> rows, so its exact-endpoint and candidate counts are equal. At least 1,000 strict SH/SZ A-share identifiers per rebalance must additionally satisfy the full joint contract across every session from </w:t>
       </w:r>
       <w:r>
         <w:rPr>
@@ -9665,18 +9928,7 @@
         <w:t>t</w:t>
       </w:r>
       <w:r>
-        <w:t xml:space="preserve">, and </w:t>
-      </w:r>
-      <w:r>
-        <w:rPr>
-          <w:rFonts w:ascii="Courier New" w:hAnsi="Courier New"/>
-          <w:color w:val="0B2545"/>
-          <w:sz w:val="18"/>
-        </w:rPr>
-        <w:t>t/t+1/t+20/t+21</w:t>
-      </w:r>
-      <w:r>
-        <w:t>. The latter is a per-symbol identifier/date-presence contract: aggregate monthly symbol counts, a dense first session, and file-level minimum or maximum dates are insufficient. The review must also establish at least 95% valid recorded publication dates among otherwise usable fundamental records; historical listing and delisting coverage; adjusted-return, corporate-action, amount, ST, suspension, and decision-cutoff semantics; a bound official common-session calendar; lawful research, aggregate-disclosure, calendar-publication, endpoint-ledger-retention, and reviewer-access rights; a passing offline test suite; and a signed prior-exposure attestation with a contemporaneous inventory of earlier specifications and known outcome access.</w:t>
+        <w:t>, and all four endpoints. These are per-symbol identifier/date-presence contracts: aggregate monthly symbol counts, a dense first session, and file-level minimum or maximum dates are insufficient. The review must also establish at least 95% valid recorded publication dates among otherwise usable fundamental records; historical listing and delisting coverage; corporate-action, amount, ST, suspension, and decision-cutoff semantics; a bound official common-session calendar; lawful research, aggregate-disclosure, calendar-publication, endpoint-ledger-retention, and reviewer-access rights; a passing offline test suite; and a signed prior-exposure attestation with a contemporaneous inventory of earlier specifications and known outcome access.</w:t>
       </w:r>
     </w:p>
     <w:p>
@@ -9714,6 +9966,11 @@
       </w:r>
     </w:p>
     <w:p>
+      <w:r>
+        <w:t>After exclusive authorization consumption, the runner captures each of the four raw inputs exactly once. Coverage recomputation, panel loading, and input evidence use those same captured bytes, so a later path replacement cannot substitute a different panel. A mismatch consumes the authorization and produces no result receipt. For a finite contract, expiry is rechecked at consumption, before outcome preparation, at every monthly execution boundary, and before receipt publication; an expired right also stops without a receipt.</w:t>
+      </w:r>
+    </w:p>
+    <w:p>
       <w:pPr>
         <w:pStyle w:val="Heading2"/>
       </w:pPr>
@@ -9723,12 +9980,12 @@
     </w:p>
     <w:p>
       <w:r>
-        <w:t>The intended package includes the timestamped plan and manifest, tagged code, public schemas and deterministic fixtures, tests, raw-file names and hashes without local paths, calendar identity, field and rights statements where permitted, the prior-specification inventory, exposure attestation, complete aggregate results, exposure and endpoint diagnostics, and a canonical receipt. Proprietary rows are not promised. An independent authorized rerun or controlled reviewer access is required. Verification checks artifact hashes, factor–variant–month identities, result counts, estimand identities, exact-support counts, and common-support identities; it does not prove vendor correctness. Real-data execution is bound to Python 3.12.12, NumPy 2.0.2, and pandas 2.3.3 and requires the entire repository, including untracked files, to be clean at the checked-out registered commit.</w:t>
+        <w:t>The intended package includes the timestamped plan and manifest, tagged code, public schemas and deterministic fixtures, tests, fixed logical file labels and permitted hashes, only the aggregate row/date counts exposed in explicit authorized receipt fields, the authorized source identity and field-mapping projection, calendar identity, the prior-specification inventory, exposure attestation, complete aggregate results, exposure and endpoint diagnostics, and a canonical receipt. Raw/control byte sizes, private operator basenames, local paths, and proprietary rows are not public artifacts. An independent authorized rerun or controlled reviewer access is required. Verification checks artifact hashes, factor–variant–month identities, result counts, estimand identities, exact-support counts, and common-support identities; it does not prove vendor correctness. Real-data execution is bound to Python 3.12.12, NumPy 2.0.2, and pandas 2.3.3 and requires the entire repository, including untracked files, to be clean at the checked-out registered commit.</w:t>
       </w:r>
     </w:p>
     <w:p>
       <w:r>
-        <w:t>The study stops without a primary conclusion if a data, rights, custody, registration, authorization, exact-endpoint, cell-completeness, publication-field, adjusted-return, official-calendar, isolation, common-support-identity, or reproduction gate fails. Negative, null, positive, mixed, and sign-reversing economic outcomes are not stop conditions.</w:t>
+        <w:t>The study stops without a primary conclusion if a data, rights, custody, registration, authorization, all-candidate exact-endpoint, cell-completeness, publication-field, provider-close-observation, supplier suspension-valuation, official-calendar, isolation, common-support-identity, or reproduction gate fails. Negative, null, positive, mixed, and sign-reversing economic outcomes are not stop conditions.</w:t>
       </w:r>
     </w:p>
     <w:p>
@@ -9749,7 +10006,7 @@
     </w:p>
     <w:p>
       <w:r>
-        <w:t>This manuscript has not been externally registered and has not received journal in-principle acceptance. The timestamped historical coverage probe has not been run; the final manifest, receipt, and authorization have not been issued; and the historical analysis has not been executed. The observed pilot is disclosed in Section 3 and Appendix A.</w:t>
+        <w:t>This manuscript has not been externally registered and has not received journal in-principle acceptance. The externally timestamped bounded source probe has not been run; the final manifest, receipt, and authorization have not been issued; and the historical analysis has not been executed. The observed pilot is disclosed in Section 3 and Appendix A.</w:t>
       </w:r>
     </w:p>
     <w:p>
@@ -9762,7 +10019,7 @@
     </w:p>
     <w:p>
       <w:r>
-        <w:t>The pilot uses licensed data that cannot be redistributed. Its aggregate evidence and analysis implementation are maintained with the research package. The proposed historical panel is not available under a completed rights and semantics attestation. Original public schemas, deterministic fixtures, plan templates, and aggregate evidence are shared under the MIT License where repository ownership permits; proprietary data and third-party materials remain subject to their separate agreements. An anonymized verification package must be used for blinded editorial review.</w:t>
+        <w:t>The legacy repository record describes the pilot's local export as licensed, and its raw rows are not redistributed. The new Stage-2 rights packet has not re-attested the publication or controlled-review basis for the already-public pilot hashes and aggregates; continued hosting or remediation therefore requires separate licensor or authorized institutional-administrator review. The proposed historical panel is not available under a completed rights and semantics attestation. Original public schemas, deterministic fixtures, plan templates, and aggregate evidence are shared under the MIT License only where repository ownership and separate data rights permit; proprietary data and third-party materials remain subject to their agreements. An author-anonymized verification package must be used for blinded editorial review; the required source-identity disclosure remains intact.</w:t>
       </w:r>
     </w:p>
     <w:p>
@@ -9794,12 +10051,7 @@
         <w:t>Draft declaration — human confirmation required before submission.</w:t>
       </w:r>
       <w:r>
-        <w:t xml:space="preserve"> OpenAI Codex was used to support literature organization, protocol consistency checking, code and evidence inspection, manuscript drafting, document generation, and editing. No historical confirmatory outcome was generated or inferred by the tool. Before submission, the named human authors must verify every source, number, method, interpretation, and disclosure; edit the manuscript as needed; record the tool and version required by the journal; and take full responsibility for the content.</w:t>
-      </w:r>
-    </w:p>
-    <w:p>
-      <w:r>
-        <w:br w:type="page"/>
+        <w:t xml:space="preserve"> OpenAI Codex supported literature organization, consistency checks, code and evidence inspection, drafting, document generation, and editing. It did not generate or infer historical confirmatory outcomes. Before submission, the named authors must verify every source, number, method, interpretation, and disclosure; record any tool and version required by the journal; and accept full responsibility.</w:t>
       </w:r>
     </w:p>
     <w:p>

</xml_diff>

<commit_message>
research: complete Stage-2 preparation materials
</commit_message>
<xml_diff>
--- a/docs/working-paper/A_Share_Factor_Specification_Effects_Stage1_Manuscript.docx
+++ b/docs/working-paper/A_Share_Factor_Specification_Effects_Stage1_Manuscript.docx
@@ -13,12 +13,9 @@
     <w:p>
       <w:pPr>
         <w:pStyle w:val="Title"/>
-        <w:pBdr>
-          <w:bottom w:val="single" w:sz="18" w:space="5" w:color="2E74B5"/>
-        </w:pBdr>
       </w:pPr>
       <w:r>
-        <w:t>Report Dates, Publication Dates, and the A-Share ROE Signal</w:t>
+        <w:t>Accounting Information Timing and the A Share ROE Signal</w:t>
       </w:r>
     </w:p>
     <w:p>
@@ -42,67 +39,31 @@
         <w:t>Anonymous manuscript for editorial evaluation</w:t>
       </w:r>
     </w:p>
-    <w:tbl>
-      <w:tblPr>
-        <w:tblW w:type="auto" w:w="0"/>
-        <w:jc w:val="center"/>
-        <w:tblLayout w:type="fixed"/>
-        <w:tblLook w:firstColumn="1" w:firstRow="1" w:lastColumn="0" w:lastRow="0" w:noHBand="0" w:noVBand="1" w:val="04A0"/>
-        <w:tblBorders>
-          <w:top w:val="single" w:sz="6" w:space="0" w:color="E0B84E"/>
-          <w:left w:val="single" w:sz="6" w:space="0" w:color="E0B84E"/>
-          <w:bottom w:val="single" w:sz="6" w:space="0" w:color="E0B84E"/>
-          <w:right w:val="single" w:sz="6" w:space="0" w:color="E0B84E"/>
-          <w:insideH w:val="single" w:sz="6" w:space="0" w:color="E0B84E"/>
-          <w:insideV w:val="single" w:sz="6" w:space="0" w:color="E0B84E"/>
-        </w:tblBorders>
-      </w:tblPr>
-      <w:tblGrid>
-        <w:gridCol w:w="10080"/>
-      </w:tblGrid>
-      <w:tr>
-        <w:trPr>
-          <w:tblHeader w:val="true"/>
-        </w:trPr>
-        <w:tc>
-          <w:tcPr>
-            <w:tcW w:type="dxa" w:w="10080"/>
-            <w:shd w:fill="FFF4CC" w:val="clear"/>
-            <w:tcMar>
-              <w:top w:w="130" w:type="dxa"/>
-              <w:start w:w="170" w:type="dxa"/>
-              <w:bottom w:w="130" w:type="dxa"/>
-              <w:end w:w="170" w:type="dxa"/>
-            </w:tcMar>
-          </w:tcPr>
-          <w:p>
-            <w:pPr>
-              <w:spacing w:after="40"/>
-            </w:pPr>
-            <w:r>
-              <w:rPr>
-                <w:b/>
-                <w:color w:val="B98500"/>
-                <w:sz w:val="18"/>
-              </w:rPr>
-              <w:t>EVIDENCE STATUS</w:t>
-            </w:r>
-          </w:p>
-          <w:p>
-            <w:pPr>
-              <w:spacing w:after="0"/>
-            </w:pPr>
-            <w:r>
-              <w:rPr>
-                <w:color w:val="0B2545"/>
-                <w:sz w:val="19"/>
-              </w:rPr>
-              <w:t>The 2025–2026 pilot is observed; its aggregate results and known limitations are publicly disclosed. The 2010–2022 historical confirmation is blocked for data feasibility, has not been externally registered or authorized, and has not been executed.</w:t>
-            </w:r>
-          </w:p>
-        </w:tc>
-      </w:tr>
-    </w:tbl>
+    <w:p>
+      <w:pPr>
+        <w:spacing w:before="100" w:after="60"/>
+      </w:pPr>
+      <w:r>
+        <w:rPr>
+          <w:b/>
+          <w:color w:val="000000"/>
+          <w:sz w:val="18"/>
+        </w:rPr>
+        <w:t>EVIDENCE STATUS</w:t>
+      </w:r>
+    </w:p>
+    <w:p>
+      <w:pPr>
+        <w:spacing w:after="140"/>
+      </w:pPr>
+      <w:r>
+        <w:rPr>
+          <w:color w:val="202830"/>
+          <w:sz w:val="19"/>
+        </w:rPr>
+        <w:t>The 2025–2026 pilot is observed; its aggregate results and known limitations are publicly disclosed. The 2010–2022 historical confirmation is blocked for data feasibility, has not been externally registered or authorized, and has not been executed.</w:t>
+      </w:r>
+    </w:p>
     <w:p/>
     <w:tbl>
       <w:tblPr>
@@ -175,7 +136,7 @@
                 <w:color w:val="27313A"/>
                 <w:sz w:val="17"/>
               </w:rPr>
-              <w:t>1 September 2026</w:t>
+              <w:t>4 September 2026</w:t>
             </w:r>
           </w:p>
         </w:tc>
@@ -409,63 +370,27 @@
         <w:t xml:space="preserve"> G12; G14; C12; M41</w:t>
       </w:r>
     </w:p>
-    <w:tbl>
-      <w:tblPr>
-        <w:tblW w:type="auto" w:w="0"/>
-        <w:jc w:val="center"/>
-        <w:tblLayout w:type="fixed"/>
-        <w:tblLook w:firstColumn="1" w:firstRow="1" w:lastColumn="0" w:lastRow="0" w:noHBand="0" w:noVBand="1" w:val="04A0"/>
-        <w:tblBorders>
-          <w:top w:val="single" w:sz="5" w:space="0" w:color="B98500"/>
-          <w:left w:val="single" w:sz="5" w:space="0" w:color="B98500"/>
-          <w:bottom w:val="single" w:sz="5" w:space="0" w:color="B98500"/>
-          <w:right w:val="single" w:sz="5" w:space="0" w:color="B98500"/>
-          <w:insideH w:val="single" w:sz="5" w:space="0" w:color="B98500"/>
-          <w:insideV w:val="single" w:sz="5" w:space="0" w:color="B98500"/>
-        </w:tblBorders>
-      </w:tblPr>
-      <w:tblGrid>
-        <w:gridCol w:w="10080"/>
-      </w:tblGrid>
-      <w:tr>
-        <w:trPr>
-          <w:tblHeader w:val="true"/>
-        </w:trPr>
-        <w:tc>
-          <w:tcPr>
-            <w:tcW w:type="dxa" w:w="10080"/>
-            <w:shd w:fill="FFF4CC" w:val="clear"/>
-            <w:tcMar>
-              <w:top w:w="100" w:type="dxa"/>
-              <w:start w:w="130" w:type="dxa"/>
-              <w:bottom w:w="100" w:type="dxa"/>
-              <w:end w:w="130" w:type="dxa"/>
-            </w:tcMar>
-          </w:tcPr>
-          <w:p>
-            <w:pPr>
-              <w:spacing w:after="0"/>
-              <w:jc w:val="left"/>
-            </w:pPr>
-            <w:r>
-              <w:rPr>
-                <w:b/>
-                <w:color w:val="0B2545"/>
-                <w:sz w:val="18"/>
-              </w:rPr>
-              <w:t>Manuscript status.</w:t>
-            </w:r>
-            <w:r>
-              <w:rPr>
-                <w:color w:val="0B2545"/>
-                <w:sz w:val="18"/>
-              </w:rPr>
-              <w:t xml:space="preserve"> This is an anonymous pre-results protocol draft. The January 2025–June 2026 pilot evaluation has been observed; its complete aggregate results and known limitations are disclosed in Appendix A. The proposed 2010–2022 historical confirmation is blocked for data feasibility, has not been externally registered or authorized, and has not been executed.</w:t>
-            </w:r>
-          </w:p>
-        </w:tc>
-      </w:tr>
-    </w:tbl>
+    <w:p>
+      <w:pPr>
+        <w:spacing w:before="40" w:after="100"/>
+        <w:jc w:val="left"/>
+      </w:pPr>
+      <w:r>
+        <w:rPr>
+          <w:b/>
+          <w:color w:val="202830"/>
+          <w:sz w:val="18"/>
+        </w:rPr>
+        <w:t>Manuscript status.</w:t>
+      </w:r>
+      <w:r>
+        <w:rPr>
+          <w:color w:val="202830"/>
+          <w:sz w:val="18"/>
+        </w:rPr>
+        <w:t xml:space="preserve"> This is an anonymous pre-results protocol draft. The January 2025–June 2026 pilot evaluation has been observed; its complete aggregate results and known limitations are disclosed in Appendix A. The proposed 2010–2022 historical confirmation is blocked for data feasibility, has not been externally registered or authorized, and has not been executed.</w:t>
+      </w:r>
+    </w:p>
     <w:p>
       <w:pPr>
         <w:pStyle w:val="Heading1"/>
@@ -2022,78 +1947,42 @@
         <w:t>A legacy feasibility audit inspected schemas and aggregate coverage in locally retained material. It did not establish that any delivery passes the fixed Stage-2 interval, field, semantic, endpoint, or rights gates, and it did not assemble or view a complete 2010–2022 factor-return or IC series. Calendar labels do not establish blindness: final eligibility remains conditional on the signed exposure inventory, independent custody, external timestamp, and authorized release.</w:t>
       </w:r>
     </w:p>
-    <w:tbl>
-      <w:tblPr>
-        <w:tblW w:type="auto" w:w="0"/>
-        <w:jc w:val="center"/>
-        <w:tblLayout w:type="fixed"/>
-        <w:tblLook w:firstColumn="1" w:firstRow="1" w:lastColumn="0" w:lastRow="0" w:noHBand="0" w:noVBand="1" w:val="04A0"/>
-        <w:tblBorders>
-          <w:top w:val="single" w:sz="5" w:space="0" w:color="B98500"/>
-          <w:left w:val="single" w:sz="5" w:space="0" w:color="B98500"/>
-          <w:bottom w:val="single" w:sz="5" w:space="0" w:color="B98500"/>
-          <w:right w:val="single" w:sz="5" w:space="0" w:color="B98500"/>
-          <w:insideH w:val="single" w:sz="5" w:space="0" w:color="B98500"/>
-          <w:insideV w:val="single" w:sz="5" w:space="0" w:color="B98500"/>
-        </w:tblBorders>
-      </w:tblPr>
-      <w:tblGrid>
-        <w:gridCol w:w="10080"/>
-      </w:tblGrid>
-      <w:tr>
-        <w:trPr>
-          <w:tblHeader w:val="true"/>
-        </w:trPr>
-        <w:tc>
-          <w:tcPr>
-            <w:tcW w:type="dxa" w:w="10080"/>
-            <w:shd w:fill="FFF4CC" w:val="clear"/>
-            <w:tcMar>
-              <w:top w:w="100" w:type="dxa"/>
-              <w:start w:w="130" w:type="dxa"/>
-              <w:bottom w:w="100" w:type="dxa"/>
-              <w:end w:w="130" w:type="dxa"/>
-            </w:tcMar>
-          </w:tcPr>
-          <w:p>
-            <w:pPr>
-              <w:spacing w:after="0"/>
-              <w:jc w:val="left"/>
-            </w:pPr>
-            <w:r>
-              <w:rPr>
-                <w:b/>
-                <w:color w:val="0B2545"/>
-                <w:sz w:val="18"/>
-              </w:rPr>
-              <w:t>Current feasibility status: BLOCKED_FOR_STAGE2.</w:t>
-            </w:r>
-            <w:r>
-              <w:rPr>
-                <w:color w:val="0B2545"/>
-                <w:sz w:val="18"/>
-              </w:rPr>
-              <w:t xml:space="preserve"> No reviewed delivery has passed the complete 2009 warm-up, 2010–2022 analysis, January 2023 endpoint, lifecycle, all-candidate exact-endpoint, official-calendar, raw-</w:t>
-            </w:r>
-            <w:r>
-              <w:rPr>
-                <w:rFonts w:ascii="Courier New" w:hAnsi="Courier New"/>
-                <w:color w:val="0B2545"/>
-                <w:sz w:val="17"/>
-              </w:rPr>
-              <w:t>roeDiluted</w:t>
-            </w:r>
-            <w:r>
-              <w:rPr>
-                <w:color w:val="0B2545"/>
-                <w:sz w:val="18"/>
-              </w:rPr>
-              <w:t>, recorded-publication-date, close-observation mapping, supplier-recorded suspension-valuation, signal-session non-degeneracy, publication-rights, and controlled-review gates. The final exposure attestation and external registration chain are also incomplete. The historical outcome analysis remains unrun.</w:t>
-            </w:r>
-          </w:p>
-        </w:tc>
-      </w:tr>
-    </w:tbl>
+    <w:p>
+      <w:pPr>
+        <w:spacing w:before="40" w:after="100"/>
+        <w:jc w:val="left"/>
+      </w:pPr>
+      <w:r>
+        <w:rPr>
+          <w:b/>
+          <w:color w:val="202830"/>
+          <w:sz w:val="18"/>
+        </w:rPr>
+        <w:t>Current feasibility status: BLOCKED_FOR_STAGE2.</w:t>
+      </w:r>
+      <w:r>
+        <w:rPr>
+          <w:color w:val="202830"/>
+          <w:sz w:val="18"/>
+        </w:rPr>
+        <w:t xml:space="preserve"> No reviewed delivery has passed the complete 2009 warm-up, 2010–2022 analysis, January 2023 endpoint, lifecycle, all-candidate exact-endpoint, official-calendar, raw-</w:t>
+      </w:r>
+      <w:r>
+        <w:rPr>
+          <w:rFonts w:ascii="Courier New" w:hAnsi="Courier New"/>
+          <w:color w:val="202830"/>
+          <w:sz w:val="17"/>
+        </w:rPr>
+        <w:t>roeDiluted</w:t>
+      </w:r>
+      <w:r>
+        <w:rPr>
+          <w:color w:val="202830"/>
+          <w:sz w:val="18"/>
+        </w:rPr>
+        <w:t>, recorded-publication-date, close-observation mapping, supplier-recorded suspension-valuation, signal-session non-degeneracy, publication-rights, and controlled-review gates. The final exposure attestation and external registration chain are also incomplete. The historical outcome analysis remains unrun.</w:t>
+      </w:r>
+    </w:p>
     <w:p>
       <w:pPr>
         <w:pStyle w:val="Heading1"/>
@@ -4266,6 +4155,1745 @@
       <w:r>
         <w:t>All 72 cell-level mean ICs, Newey–West t-statistics, top-minus-universe diagnostics, mean cross-sectional counts, and endpoint-reason counts will be displayed. They are descriptive completeness outputs, not 72 discovery tests. The paper will not headline the maximum, select the better of IC and quintile spread, or conceal a null or sign-reversing cell. Dedicated outcome-free exposure diagnostics and the exact common-support accounting are mandatory outputs. Formal interactions, alternative factors, next-open portfolios, costs, turnover, capacity, and announcement-event studies are excluded unless completed, tested, and externally frozen before confirmatory outcome access under a new or amended protocol accepted by the registration authority.</w:t>
       </w:r>
+    </w:p>
+    <w:p>
+      <w:pPr>
+        <w:pStyle w:val="Heading2"/>
+      </w:pPr>
+      <w:r>
+        <w:t>6.1 Pre-specified result tables</w:t>
+      </w:r>
+    </w:p>
+    <w:p>
+      <w:r>
+        <w:t xml:space="preserve">The post-results paper will populate the fixed shell below directly from the verified Stage-2 receipt. The complete 72-cell and 28-secondary layouts are fixed in the accompanying </w:t>
+      </w:r>
+      <w:r>
+        <w:rPr>
+          <w:rFonts w:ascii="Courier New" w:hAnsi="Courier New"/>
+          <w:color w:val="0B2545"/>
+          <w:sz w:val="18"/>
+        </w:rPr>
+        <w:t>prespecified_results_tables.md</w:t>
+      </w:r>
+      <w:r>
+        <w:t xml:space="preserve">; they will not be assembled by hand after the estimates are known. Every empirical field remains marked </w:t>
+      </w:r>
+      <w:r>
+        <w:rPr>
+          <w:b/>
+        </w:rPr>
+        <w:t>Not yet estimated</w:t>
+      </w:r>
+      <w:r>
+        <w:t xml:space="preserve"> in this pre-results manuscript.</w:t>
+      </w:r>
+    </w:p>
+    <w:p>
+      <w:pPr>
+        <w:pStyle w:val="Caption"/>
+      </w:pPr>
+      <w:r>
+        <w:rPr>
+          <w:b/>
+        </w:rPr>
+        <w:t>Table 4. Pre-specified historical result shell</w:t>
+      </w:r>
+    </w:p>
+    <w:tbl>
+      <w:tblPr>
+        <w:tblW w:type="dxa" w:w="10080"/>
+        <w:jc w:val="center"/>
+        <w:tblLayout w:type="fixed"/>
+        <w:tblLook w:firstColumn="1" w:firstRow="1" w:lastColumn="0" w:lastRow="0" w:noHBand="0" w:noVBand="1" w:val="04A0"/>
+        <w:tblBorders>
+          <w:top w:val="single" w:sz="4" w:space="0" w:color="B8C5D3"/>
+          <w:left w:val="single" w:sz="4" w:space="0" w:color="B8C5D3"/>
+          <w:bottom w:val="single" w:sz="4" w:space="0" w:color="B8C5D3"/>
+          <w:right w:val="single" w:sz="4" w:space="0" w:color="B8C5D3"/>
+          <w:insideH w:val="single" w:sz="4" w:space="0" w:color="B8C5D3"/>
+          <w:insideV w:val="single" w:sz="4" w:space="0" w:color="B8C5D3"/>
+        </w:tblBorders>
+      </w:tblPr>
+      <w:tblGrid>
+        <w:gridCol w:w="1656"/>
+        <w:gridCol w:w="1080"/>
+        <w:gridCol w:w="3384"/>
+        <w:gridCol w:w="1656"/>
+        <w:gridCol w:w="2304"/>
+      </w:tblGrid>
+      <w:tr>
+        <w:trPr>
+          <w:tblHeader w:val="true"/>
+          <w:cantSplit/>
+        </w:trPr>
+        <w:tc>
+          <w:tcPr>
+            <w:tcW w:type="dxa" w:w="1656"/>
+            <w:tcMar>
+              <w:top w:w="58" w:type="dxa"/>
+              <w:start w:w="72" w:type="dxa"/>
+              <w:bottom w:w="58" w:type="dxa"/>
+              <w:end w:w="72" w:type="dxa"/>
+            </w:tcMar>
+            <w:vAlign w:val="center"/>
+            <w:shd w:fill="E9EFF5" w:val="clear"/>
+          </w:tcPr>
+          <w:p>
+            <w:pPr>
+              <w:spacing w:after="0" w:line="240" w:lineRule="auto"/>
+              <w:jc w:val="left"/>
+            </w:pPr>
+            <w:r>
+              <w:rPr>
+                <w:b/>
+                <w:color w:val="0B2545"/>
+                <w:sz w:val="15"/>
+              </w:rPr>
+              <w:t>Output</w:t>
+            </w:r>
+          </w:p>
+        </w:tc>
+        <w:tc>
+          <w:tcPr>
+            <w:tcW w:type="dxa" w:w="1080"/>
+            <w:tcMar>
+              <w:top w:w="58" w:type="dxa"/>
+              <w:start w:w="72" w:type="dxa"/>
+              <w:bottom w:w="58" w:type="dxa"/>
+              <w:end w:w="72" w:type="dxa"/>
+            </w:tcMar>
+            <w:vAlign w:val="center"/>
+            <w:shd w:fill="E9EFF5" w:val="clear"/>
+          </w:tcPr>
+          <w:p>
+            <w:pPr>
+              <w:spacing w:after="0" w:line="240" w:lineRule="auto"/>
+              <w:jc w:val="center"/>
+            </w:pPr>
+            <w:r>
+              <w:rPr>
+                <w:b/>
+                <w:color w:val="0B2545"/>
+                <w:sz w:val="15"/>
+              </w:rPr>
+              <w:t>Registered count</w:t>
+            </w:r>
+          </w:p>
+        </w:tc>
+        <w:tc>
+          <w:tcPr>
+            <w:tcW w:type="dxa" w:w="3384"/>
+            <w:tcMar>
+              <w:top w:w="58" w:type="dxa"/>
+              <w:start w:w="72" w:type="dxa"/>
+              <w:bottom w:w="58" w:type="dxa"/>
+              <w:end w:w="72" w:type="dxa"/>
+            </w:tcMar>
+            <w:vAlign w:val="center"/>
+            <w:shd w:fill="E9EFF5" w:val="clear"/>
+          </w:tcPr>
+          <w:p>
+            <w:pPr>
+              <w:spacing w:after="0" w:line="240" w:lineRule="auto"/>
+              <w:jc w:val="left"/>
+            </w:pPr>
+            <w:r>
+              <w:rPr>
+                <w:b/>
+                <w:color w:val="0B2545"/>
+                <w:sz w:val="15"/>
+              </w:rPr>
+              <w:t>Estimator or rule</w:t>
+            </w:r>
+          </w:p>
+        </w:tc>
+        <w:tc>
+          <w:tcPr>
+            <w:tcW w:type="dxa" w:w="1656"/>
+            <w:tcMar>
+              <w:top w:w="58" w:type="dxa"/>
+              <w:start w:w="72" w:type="dxa"/>
+              <w:bottom w:w="58" w:type="dxa"/>
+              <w:end w:w="72" w:type="dxa"/>
+            </w:tcMar>
+            <w:vAlign w:val="center"/>
+            <w:shd w:fill="E9EFF5" w:val="clear"/>
+          </w:tcPr>
+          <w:p>
+            <w:pPr>
+              <w:spacing w:after="0" w:line="240" w:lineRule="auto"/>
+              <w:jc w:val="left"/>
+            </w:pPr>
+            <w:r>
+              <w:rPr>
+                <w:b/>
+                <w:color w:val="0B2545"/>
+                <w:sz w:val="15"/>
+              </w:rPr>
+              <w:t>Stage-2 result</w:t>
+            </w:r>
+          </w:p>
+        </w:tc>
+        <w:tc>
+          <w:tcPr>
+            <w:tcW w:type="dxa" w:w="2304"/>
+            <w:tcMar>
+              <w:top w:w="58" w:type="dxa"/>
+              <w:start w:w="72" w:type="dxa"/>
+              <w:bottom w:w="58" w:type="dxa"/>
+              <w:end w:w="72" w:type="dxa"/>
+            </w:tcMar>
+            <w:vAlign w:val="center"/>
+            <w:shd w:fill="E9EFF5" w:val="clear"/>
+          </w:tcPr>
+          <w:p>
+            <w:pPr>
+              <w:spacing w:after="0" w:line="240" w:lineRule="auto"/>
+              <w:jc w:val="left"/>
+            </w:pPr>
+            <w:r>
+              <w:rPr>
+                <w:b/>
+                <w:color w:val="0B2545"/>
+                <w:sz w:val="15"/>
+              </w:rPr>
+              <w:t>Claim status</w:t>
+            </w:r>
+          </w:p>
+        </w:tc>
+      </w:tr>
+      <w:tr>
+        <w:trPr>
+          <w:cantSplit/>
+        </w:trPr>
+        <w:tc>
+          <w:tcPr>
+            <w:tcW w:type="dxa" w:w="1656"/>
+            <w:tcMar>
+              <w:top w:w="58" w:type="dxa"/>
+              <w:start w:w="72" w:type="dxa"/>
+              <w:bottom w:w="58" w:type="dxa"/>
+              <w:end w:w="72" w:type="dxa"/>
+            </w:tcMar>
+            <w:vAlign w:val="center"/>
+          </w:tcPr>
+          <w:p>
+            <w:pPr>
+              <w:spacing w:after="0" w:line="240" w:lineRule="auto"/>
+              <w:jc w:val="left"/>
+            </w:pPr>
+            <w:r>
+              <w:rPr>
+                <w:color w:val="26313B"/>
+                <w:sz w:val="15"/>
+              </w:rPr>
+              <w:t>Primary P1</w:t>
+            </w:r>
+          </w:p>
+        </w:tc>
+        <w:tc>
+          <w:tcPr>
+            <w:tcW w:type="dxa" w:w="1080"/>
+            <w:tcMar>
+              <w:top w:w="58" w:type="dxa"/>
+              <w:start w:w="72" w:type="dxa"/>
+              <w:bottom w:w="58" w:type="dxa"/>
+              <w:end w:w="72" w:type="dxa"/>
+            </w:tcMar>
+            <w:vAlign w:val="center"/>
+          </w:tcPr>
+          <w:p>
+            <w:pPr>
+              <w:spacing w:after="0" w:line="240" w:lineRule="auto"/>
+              <w:jc w:val="center"/>
+            </w:pPr>
+            <w:r>
+              <w:rPr>
+                <w:color w:val="26313B"/>
+                <w:sz w:val="15"/>
+              </w:rPr>
+              <w:t>1</w:t>
+            </w:r>
+          </w:p>
+        </w:tc>
+        <w:tc>
+          <w:tcPr>
+            <w:tcW w:type="dxa" w:w="3384"/>
+            <w:tcMar>
+              <w:top w:w="58" w:type="dxa"/>
+              <w:start w:w="72" w:type="dxa"/>
+              <w:bottom w:w="58" w:type="dxa"/>
+              <w:end w:w="72" w:type="dxa"/>
+            </w:tcMar>
+            <w:vAlign w:val="center"/>
+          </w:tcPr>
+          <w:p>
+            <w:pPr>
+              <w:spacing w:after="0" w:line="240" w:lineRule="auto"/>
+              <w:jc w:val="left"/>
+            </w:pPr>
+            <w:r>
+              <w:rPr>
+                <w:color w:val="26313B"/>
+                <w:sz w:val="15"/>
+              </w:rPr>
+              <w:t xml:space="preserve">Mean monthly ROE IC difference </w:t>
+            </w:r>
+            <w:r>
+              <w:rPr>
+                <w:rFonts w:ascii="Courier New" w:hAnsi="Courier New"/>
+                <w:color w:val="26313B"/>
+                <w:sz w:val="14"/>
+              </w:rPr>
+              <w:t>I0000 − A1</w:t>
+            </w:r>
+            <w:r>
+              <w:rPr>
+                <w:color w:val="26313B"/>
+                <w:sz w:val="15"/>
+              </w:rPr>
+              <w:t>; NW HAC lag 3; two-sided 95% CI and p-value</w:t>
+            </w:r>
+          </w:p>
+        </w:tc>
+        <w:tc>
+          <w:tcPr>
+            <w:tcW w:type="dxa" w:w="1656"/>
+            <w:tcMar>
+              <w:top w:w="58" w:type="dxa"/>
+              <w:start w:w="72" w:type="dxa"/>
+              <w:bottom w:w="58" w:type="dxa"/>
+              <w:end w:w="72" w:type="dxa"/>
+            </w:tcMar>
+            <w:vAlign w:val="center"/>
+          </w:tcPr>
+          <w:p>
+            <w:pPr>
+              <w:spacing w:after="0" w:line="240" w:lineRule="auto"/>
+              <w:jc w:val="left"/>
+            </w:pPr>
+            <w:r>
+              <w:rPr>
+                <w:color w:val="26313B"/>
+                <w:sz w:val="15"/>
+              </w:rPr>
+              <w:t>Not yet estimated</w:t>
+            </w:r>
+          </w:p>
+        </w:tc>
+        <w:tc>
+          <w:tcPr>
+            <w:tcW w:type="dxa" w:w="2304"/>
+            <w:tcMar>
+              <w:top w:w="58" w:type="dxa"/>
+              <w:start w:w="72" w:type="dxa"/>
+              <w:bottom w:w="58" w:type="dxa"/>
+              <w:end w:w="72" w:type="dxa"/>
+            </w:tcMar>
+            <w:vAlign w:val="center"/>
+          </w:tcPr>
+          <w:p>
+            <w:pPr>
+              <w:spacing w:after="0" w:line="240" w:lineRule="auto"/>
+              <w:jc w:val="left"/>
+            </w:pPr>
+            <w:r>
+              <w:rPr>
+                <w:color w:val="26313B"/>
+                <w:sz w:val="15"/>
+              </w:rPr>
+              <w:t>Ineligible before authorized execution</w:t>
+            </w:r>
+          </w:p>
+        </w:tc>
+      </w:tr>
+      <w:tr>
+        <w:trPr>
+          <w:cantSplit/>
+        </w:trPr>
+        <w:tc>
+          <w:tcPr>
+            <w:tcW w:type="dxa" w:w="1656"/>
+            <w:tcMar>
+              <w:top w:w="58" w:type="dxa"/>
+              <w:start w:w="72" w:type="dxa"/>
+              <w:bottom w:w="58" w:type="dxa"/>
+              <w:end w:w="72" w:type="dxa"/>
+            </w:tcMar>
+            <w:vAlign w:val="center"/>
+            <w:shd w:fill="F8FAFC" w:val="clear"/>
+          </w:tcPr>
+          <w:p>
+            <w:pPr>
+              <w:spacing w:after="0" w:line="240" w:lineRule="auto"/>
+              <w:jc w:val="left"/>
+            </w:pPr>
+            <w:r>
+              <w:rPr>
+                <w:color w:val="26313B"/>
+                <w:sz w:val="15"/>
+              </w:rPr>
+              <w:t>Ordered ROE timing identity</w:t>
+            </w:r>
+          </w:p>
+        </w:tc>
+        <w:tc>
+          <w:tcPr>
+            <w:tcW w:type="dxa" w:w="1080"/>
+            <w:tcMar>
+              <w:top w:w="58" w:type="dxa"/>
+              <w:start w:w="72" w:type="dxa"/>
+              <w:bottom w:w="58" w:type="dxa"/>
+              <w:end w:w="72" w:type="dxa"/>
+            </w:tcMar>
+            <w:vAlign w:val="center"/>
+            <w:shd w:fill="F8FAFC" w:val="clear"/>
+          </w:tcPr>
+          <w:p>
+            <w:pPr>
+              <w:spacing w:after="0" w:line="240" w:lineRule="auto"/>
+              <w:jc w:val="center"/>
+            </w:pPr>
+            <w:r>
+              <w:rPr>
+                <w:color w:val="26313B"/>
+                <w:sz w:val="15"/>
+              </w:rPr>
+              <w:t>3</w:t>
+            </w:r>
+          </w:p>
+        </w:tc>
+        <w:tc>
+          <w:tcPr>
+            <w:tcW w:type="dxa" w:w="3384"/>
+            <w:tcMar>
+              <w:top w:w="58" w:type="dxa"/>
+              <w:start w:w="72" w:type="dxa"/>
+              <w:bottom w:w="58" w:type="dxa"/>
+              <w:end w:w="72" w:type="dxa"/>
+            </w:tcMar>
+            <w:vAlign w:val="center"/>
+            <w:shd w:fill="F8FAFC" w:val="clear"/>
+          </w:tcPr>
+          <w:p>
+            <w:pPr>
+              <w:spacing w:after="0" w:line="240" w:lineRule="auto"/>
+              <w:jc w:val="left"/>
+            </w:pPr>
+            <w:r>
+              <w:rPr>
+                <w:color w:val="26313B"/>
+                <w:sz w:val="15"/>
+              </w:rPr>
+              <w:t>Report-support restriction; common-support record replacement; publication-support extension</w:t>
+            </w:r>
+          </w:p>
+        </w:tc>
+        <w:tc>
+          <w:tcPr>
+            <w:tcW w:type="dxa" w:w="1656"/>
+            <w:tcMar>
+              <w:top w:w="58" w:type="dxa"/>
+              <w:start w:w="72" w:type="dxa"/>
+              <w:bottom w:w="58" w:type="dxa"/>
+              <w:end w:w="72" w:type="dxa"/>
+            </w:tcMar>
+            <w:vAlign w:val="center"/>
+            <w:shd w:fill="F8FAFC" w:val="clear"/>
+          </w:tcPr>
+          <w:p>
+            <w:pPr>
+              <w:spacing w:after="0" w:line="240" w:lineRule="auto"/>
+              <w:jc w:val="left"/>
+            </w:pPr>
+            <w:r>
+              <w:rPr>
+                <w:color w:val="26313B"/>
+                <w:sz w:val="15"/>
+              </w:rPr>
+              <w:t>Not yet estimated</w:t>
+            </w:r>
+          </w:p>
+        </w:tc>
+        <w:tc>
+          <w:tcPr>
+            <w:tcW w:type="dxa" w:w="2304"/>
+            <w:tcMar>
+              <w:top w:w="58" w:type="dxa"/>
+              <w:start w:w="72" w:type="dxa"/>
+              <w:bottom w:w="58" w:type="dxa"/>
+              <w:end w:w="72" w:type="dxa"/>
+            </w:tcMar>
+            <w:vAlign w:val="center"/>
+            <w:shd w:fill="F8FAFC" w:val="clear"/>
+          </w:tcPr>
+          <w:p>
+            <w:pPr>
+              <w:spacing w:after="0" w:line="240" w:lineRule="auto"/>
+              <w:jc w:val="left"/>
+            </w:pPr>
+            <w:r>
+              <w:rPr>
+                <w:color w:val="26313B"/>
+                <w:sz w:val="15"/>
+              </w:rPr>
+              <w:t>Secondary; BH-28 family</w:t>
+            </w:r>
+          </w:p>
+        </w:tc>
+      </w:tr>
+      <w:tr>
+        <w:trPr>
+          <w:cantSplit/>
+        </w:trPr>
+        <w:tc>
+          <w:tcPr>
+            <w:tcW w:type="dxa" w:w="1656"/>
+            <w:tcMar>
+              <w:top w:w="58" w:type="dxa"/>
+              <w:start w:w="72" w:type="dxa"/>
+              <w:bottom w:w="58" w:type="dxa"/>
+              <w:end w:w="72" w:type="dxa"/>
+            </w:tcMar>
+            <w:vAlign w:val="center"/>
+          </w:tcPr>
+          <w:p>
+            <w:pPr>
+              <w:spacing w:after="0" w:line="240" w:lineRule="auto"/>
+              <w:jc w:val="left"/>
+            </w:pPr>
+            <w:r>
+              <w:rPr>
+                <w:color w:val="26313B"/>
+                <w:sz w:val="15"/>
+              </w:rPr>
+              <w:t>Other secondary estimands</w:t>
+            </w:r>
+          </w:p>
+        </w:tc>
+        <w:tc>
+          <w:tcPr>
+            <w:tcW w:type="dxa" w:w="1080"/>
+            <w:tcMar>
+              <w:top w:w="58" w:type="dxa"/>
+              <w:start w:w="72" w:type="dxa"/>
+              <w:bottom w:w="58" w:type="dxa"/>
+              <w:end w:w="72" w:type="dxa"/>
+            </w:tcMar>
+            <w:vAlign w:val="center"/>
+          </w:tcPr>
+          <w:p>
+            <w:pPr>
+              <w:spacing w:after="0" w:line="240" w:lineRule="auto"/>
+              <w:jc w:val="center"/>
+            </w:pPr>
+            <w:r>
+              <w:rPr>
+                <w:color w:val="26313B"/>
+                <w:sz w:val="15"/>
+              </w:rPr>
+              <w:t>25</w:t>
+            </w:r>
+          </w:p>
+        </w:tc>
+        <w:tc>
+          <w:tcPr>
+            <w:tcW w:type="dxa" w:w="3384"/>
+            <w:tcMar>
+              <w:top w:w="58" w:type="dxa"/>
+              <w:start w:w="72" w:type="dxa"/>
+              <w:bottom w:w="58" w:type="dxa"/>
+              <w:end w:w="72" w:type="dxa"/>
+            </w:tcMar>
+            <w:vAlign w:val="center"/>
+          </w:tcPr>
+          <w:p>
+            <w:pPr>
+              <w:spacing w:after="0" w:line="240" w:lineRule="auto"/>
+              <w:jc w:val="left"/>
+            </w:pPr>
+            <w:r>
+              <w:rPr>
+                <w:color w:val="26313B"/>
+                <w:sz w:val="15"/>
+              </w:rPr>
+              <w:t>Composite timing; eight paired effects; sixteen component-factor Shapley effects</w:t>
+            </w:r>
+          </w:p>
+        </w:tc>
+        <w:tc>
+          <w:tcPr>
+            <w:tcW w:type="dxa" w:w="1656"/>
+            <w:tcMar>
+              <w:top w:w="58" w:type="dxa"/>
+              <w:start w:w="72" w:type="dxa"/>
+              <w:bottom w:w="58" w:type="dxa"/>
+              <w:end w:w="72" w:type="dxa"/>
+            </w:tcMar>
+            <w:vAlign w:val="center"/>
+          </w:tcPr>
+          <w:p>
+            <w:pPr>
+              <w:spacing w:after="0" w:line="240" w:lineRule="auto"/>
+              <w:jc w:val="left"/>
+            </w:pPr>
+            <w:r>
+              <w:rPr>
+                <w:color w:val="26313B"/>
+                <w:sz w:val="15"/>
+              </w:rPr>
+              <w:t>Not yet estimated</w:t>
+            </w:r>
+          </w:p>
+        </w:tc>
+        <w:tc>
+          <w:tcPr>
+            <w:tcW w:type="dxa" w:w="2304"/>
+            <w:tcMar>
+              <w:top w:w="58" w:type="dxa"/>
+              <w:start w:w="72" w:type="dxa"/>
+              <w:bottom w:w="58" w:type="dxa"/>
+              <w:end w:w="72" w:type="dxa"/>
+            </w:tcMar>
+            <w:vAlign w:val="center"/>
+          </w:tcPr>
+          <w:p>
+            <w:pPr>
+              <w:spacing w:after="0" w:line="240" w:lineRule="auto"/>
+              <w:jc w:val="left"/>
+            </w:pPr>
+            <w:r>
+              <w:rPr>
+                <w:color w:val="26313B"/>
+                <w:sz w:val="15"/>
+              </w:rPr>
+              <w:t>Secondary; BH-28 family</w:t>
+            </w:r>
+          </w:p>
+        </w:tc>
+      </w:tr>
+      <w:tr>
+        <w:trPr>
+          <w:cantSplit/>
+        </w:trPr>
+        <w:tc>
+          <w:tcPr>
+            <w:tcW w:type="dxa" w:w="1656"/>
+            <w:tcMar>
+              <w:top w:w="58" w:type="dxa"/>
+              <w:start w:w="72" w:type="dxa"/>
+              <w:bottom w:w="58" w:type="dxa"/>
+              <w:end w:w="72" w:type="dxa"/>
+            </w:tcMar>
+            <w:vAlign w:val="center"/>
+            <w:shd w:fill="F8FAFC" w:val="clear"/>
+          </w:tcPr>
+          <w:p>
+            <w:pPr>
+              <w:spacing w:after="0" w:line="240" w:lineRule="auto"/>
+              <w:jc w:val="left"/>
+            </w:pPr>
+            <w:r>
+              <w:rPr>
+                <w:color w:val="26313B"/>
+                <w:sz w:val="15"/>
+              </w:rPr>
+              <w:t>Timing-isolation checks</w:t>
+            </w:r>
+          </w:p>
+        </w:tc>
+        <w:tc>
+          <w:tcPr>
+            <w:tcW w:type="dxa" w:w="1080"/>
+            <w:tcMar>
+              <w:top w:w="58" w:type="dxa"/>
+              <w:start w:w="72" w:type="dxa"/>
+              <w:bottom w:w="58" w:type="dxa"/>
+              <w:end w:w="72" w:type="dxa"/>
+            </w:tcMar>
+            <w:vAlign w:val="center"/>
+            <w:shd w:fill="F8FAFC" w:val="clear"/>
+          </w:tcPr>
+          <w:p>
+            <w:pPr>
+              <w:spacing w:after="0" w:line="240" w:lineRule="auto"/>
+              <w:jc w:val="center"/>
+            </w:pPr>
+            <w:r>
+              <w:rPr>
+                <w:color w:val="26313B"/>
+                <w:sz w:val="15"/>
+              </w:rPr>
+              <w:t>2</w:t>
+            </w:r>
+          </w:p>
+        </w:tc>
+        <w:tc>
+          <w:tcPr>
+            <w:tcW w:type="dxa" w:w="3384"/>
+            <w:tcMar>
+              <w:top w:w="58" w:type="dxa"/>
+              <w:start w:w="72" w:type="dxa"/>
+              <w:bottom w:w="58" w:type="dxa"/>
+              <w:end w:w="72" w:type="dxa"/>
+            </w:tcMar>
+            <w:vAlign w:val="center"/>
+            <w:shd w:fill="F8FAFC" w:val="clear"/>
+          </w:tcPr>
+          <w:p>
+            <w:pPr>
+              <w:spacing w:after="0" w:line="240" w:lineRule="auto"/>
+              <w:jc w:val="left"/>
+            </w:pPr>
+            <w:r>
+              <w:rPr>
+                <w:color w:val="26313B"/>
+                <w:sz w:val="15"/>
+              </w:rPr>
+              <w:t xml:space="preserve">Momentum and low-volatility </w:t>
+            </w:r>
+            <w:r>
+              <w:rPr>
+                <w:rFonts w:ascii="Courier New" w:hAnsi="Courier New"/>
+                <w:color w:val="26313B"/>
+                <w:sz w:val="14"/>
+              </w:rPr>
+              <w:t>I0000 − A1</w:t>
+            </w:r>
+            <w:r>
+              <w:rPr>
+                <w:color w:val="26313B"/>
+                <w:sz w:val="15"/>
+              </w:rPr>
+              <w:t xml:space="preserve">; absolute tolerance </w:t>
+            </w:r>
+            <w:r>
+              <w:rPr>
+                <w:rFonts w:ascii="Courier New" w:hAnsi="Courier New"/>
+                <w:color w:val="26313B"/>
+                <w:sz w:val="14"/>
+              </w:rPr>
+              <w:t>1e−12</w:t>
+            </w:r>
+          </w:p>
+        </w:tc>
+        <w:tc>
+          <w:tcPr>
+            <w:tcW w:type="dxa" w:w="1656"/>
+            <w:tcMar>
+              <w:top w:w="58" w:type="dxa"/>
+              <w:start w:w="72" w:type="dxa"/>
+              <w:bottom w:w="58" w:type="dxa"/>
+              <w:end w:w="72" w:type="dxa"/>
+            </w:tcMar>
+            <w:vAlign w:val="center"/>
+            <w:shd w:fill="F8FAFC" w:val="clear"/>
+          </w:tcPr>
+          <w:p>
+            <w:pPr>
+              <w:spacing w:after="0" w:line="240" w:lineRule="auto"/>
+              <w:jc w:val="left"/>
+            </w:pPr>
+            <w:r>
+              <w:rPr>
+                <w:color w:val="26313B"/>
+                <w:sz w:val="15"/>
+              </w:rPr>
+              <w:t>Not yet estimated</w:t>
+            </w:r>
+          </w:p>
+        </w:tc>
+        <w:tc>
+          <w:tcPr>
+            <w:tcW w:type="dxa" w:w="2304"/>
+            <w:tcMar>
+              <w:top w:w="58" w:type="dxa"/>
+              <w:start w:w="72" w:type="dxa"/>
+              <w:bottom w:w="58" w:type="dxa"/>
+              <w:end w:w="72" w:type="dxa"/>
+            </w:tcMar>
+            <w:vAlign w:val="center"/>
+            <w:shd w:fill="F8FAFC" w:val="clear"/>
+          </w:tcPr>
+          <w:p>
+            <w:pPr>
+              <w:spacing w:after="0" w:line="240" w:lineRule="auto"/>
+              <w:jc w:val="left"/>
+            </w:pPr>
+            <w:r>
+              <w:rPr>
+                <w:color w:val="26313B"/>
+                <w:sz w:val="15"/>
+              </w:rPr>
+              <w:t>Deterministic validity checks</w:t>
+            </w:r>
+          </w:p>
+        </w:tc>
+      </w:tr>
+      <w:tr>
+        <w:trPr>
+          <w:cantSplit/>
+        </w:trPr>
+        <w:tc>
+          <w:tcPr>
+            <w:tcW w:type="dxa" w:w="1656"/>
+            <w:tcMar>
+              <w:top w:w="58" w:type="dxa"/>
+              <w:start w:w="72" w:type="dxa"/>
+              <w:bottom w:w="58" w:type="dxa"/>
+              <w:end w:w="72" w:type="dxa"/>
+            </w:tcMar>
+            <w:vAlign w:val="center"/>
+          </w:tcPr>
+          <w:p>
+            <w:pPr>
+              <w:spacing w:after="0" w:line="240" w:lineRule="auto"/>
+              <w:jc w:val="left"/>
+            </w:pPr>
+            <w:r>
+              <w:rPr>
+                <w:color w:val="26313B"/>
+                <w:sz w:val="15"/>
+              </w:rPr>
+              <w:t>Factor-variant cells</w:t>
+            </w:r>
+          </w:p>
+        </w:tc>
+        <w:tc>
+          <w:tcPr>
+            <w:tcW w:type="dxa" w:w="1080"/>
+            <w:tcMar>
+              <w:top w:w="58" w:type="dxa"/>
+              <w:start w:w="72" w:type="dxa"/>
+              <w:bottom w:w="58" w:type="dxa"/>
+              <w:end w:w="72" w:type="dxa"/>
+            </w:tcMar>
+            <w:vAlign w:val="center"/>
+          </w:tcPr>
+          <w:p>
+            <w:pPr>
+              <w:spacing w:after="0" w:line="240" w:lineRule="auto"/>
+              <w:jc w:val="center"/>
+            </w:pPr>
+            <w:r>
+              <w:rPr>
+                <w:color w:val="26313B"/>
+                <w:sz w:val="15"/>
+              </w:rPr>
+              <w:t>72</w:t>
+            </w:r>
+          </w:p>
+        </w:tc>
+        <w:tc>
+          <w:tcPr>
+            <w:tcW w:type="dxa" w:w="3384"/>
+            <w:tcMar>
+              <w:top w:w="58" w:type="dxa"/>
+              <w:start w:w="72" w:type="dxa"/>
+              <w:bottom w:w="58" w:type="dxa"/>
+              <w:end w:w="72" w:type="dxa"/>
+            </w:tcMar>
+            <w:vAlign w:val="center"/>
+          </w:tcPr>
+          <w:p>
+            <w:pPr>
+              <w:spacing w:after="0" w:line="240" w:lineRule="auto"/>
+              <w:jc w:val="left"/>
+            </w:pPr>
+            <w:r>
+              <w:rPr>
+                <w:color w:val="26313B"/>
+                <w:sz w:val="15"/>
+              </w:rPr>
+              <w:t>Mean IC; NW t; top-minus-universe; mean N; exact endpoint counts</w:t>
+            </w:r>
+          </w:p>
+        </w:tc>
+        <w:tc>
+          <w:tcPr>
+            <w:tcW w:type="dxa" w:w="1656"/>
+            <w:tcMar>
+              <w:top w:w="58" w:type="dxa"/>
+              <w:start w:w="72" w:type="dxa"/>
+              <w:bottom w:w="58" w:type="dxa"/>
+              <w:end w:w="72" w:type="dxa"/>
+            </w:tcMar>
+            <w:vAlign w:val="center"/>
+          </w:tcPr>
+          <w:p>
+            <w:pPr>
+              <w:spacing w:after="0" w:line="240" w:lineRule="auto"/>
+              <w:jc w:val="left"/>
+            </w:pPr>
+            <w:r>
+              <w:rPr>
+                <w:color w:val="26313B"/>
+                <w:sz w:val="15"/>
+              </w:rPr>
+              <w:t>Not yet estimated</w:t>
+            </w:r>
+          </w:p>
+        </w:tc>
+        <w:tc>
+          <w:tcPr>
+            <w:tcW w:type="dxa" w:w="2304"/>
+            <w:tcMar>
+              <w:top w:w="58" w:type="dxa"/>
+              <w:start w:w="72" w:type="dxa"/>
+              <w:bottom w:w="58" w:type="dxa"/>
+              <w:end w:w="72" w:type="dxa"/>
+            </w:tcMar>
+            <w:vAlign w:val="center"/>
+          </w:tcPr>
+          <w:p>
+            <w:pPr>
+              <w:spacing w:after="0" w:line="240" w:lineRule="auto"/>
+              <w:jc w:val="left"/>
+            </w:pPr>
+            <w:r>
+              <w:rPr>
+                <w:color w:val="26313B"/>
+                <w:sz w:val="15"/>
+              </w:rPr>
+              <w:t>Descriptive completeness only</w:t>
+            </w:r>
+          </w:p>
+        </w:tc>
+      </w:tr>
+      <w:tr>
+        <w:trPr>
+          <w:cantSplit/>
+        </w:trPr>
+        <w:tc>
+          <w:tcPr>
+            <w:tcW w:type="dxa" w:w="1656"/>
+            <w:tcMar>
+              <w:top w:w="58" w:type="dxa"/>
+              <w:start w:w="72" w:type="dxa"/>
+              <w:bottom w:w="58" w:type="dxa"/>
+              <w:end w:w="72" w:type="dxa"/>
+            </w:tcMar>
+            <w:vAlign w:val="center"/>
+            <w:shd w:fill="F8FAFC" w:val="clear"/>
+          </w:tcPr>
+          <w:p>
+            <w:pPr>
+              <w:spacing w:after="0" w:line="240" w:lineRule="auto"/>
+              <w:jc w:val="left"/>
+            </w:pPr>
+            <w:r>
+              <w:rPr>
+                <w:color w:val="26313B"/>
+                <w:sz w:val="15"/>
+              </w:rPr>
+              <w:t>Global evidence status</w:t>
+            </w:r>
+          </w:p>
+        </w:tc>
+        <w:tc>
+          <w:tcPr>
+            <w:tcW w:type="dxa" w:w="1080"/>
+            <w:tcMar>
+              <w:top w:w="58" w:type="dxa"/>
+              <w:start w:w="72" w:type="dxa"/>
+              <w:bottom w:w="58" w:type="dxa"/>
+              <w:end w:w="72" w:type="dxa"/>
+            </w:tcMar>
+            <w:vAlign w:val="center"/>
+            <w:shd w:fill="F8FAFC" w:val="clear"/>
+          </w:tcPr>
+          <w:p>
+            <w:pPr>
+              <w:spacing w:after="0" w:line="240" w:lineRule="auto"/>
+              <w:jc w:val="center"/>
+            </w:pPr>
+            <w:r>
+              <w:rPr>
+                <w:color w:val="26313B"/>
+                <w:sz w:val="15"/>
+              </w:rPr>
+              <w:t>1</w:t>
+            </w:r>
+          </w:p>
+        </w:tc>
+        <w:tc>
+          <w:tcPr>
+            <w:tcW w:type="dxa" w:w="3384"/>
+            <w:tcMar>
+              <w:top w:w="58" w:type="dxa"/>
+              <w:start w:w="72" w:type="dxa"/>
+              <w:bottom w:w="58" w:type="dxa"/>
+              <w:end w:w="72" w:type="dxa"/>
+            </w:tcMar>
+            <w:vAlign w:val="center"/>
+            <w:shd w:fill="F8FAFC" w:val="clear"/>
+          </w:tcPr>
+          <w:p>
+            <w:pPr>
+              <w:spacing w:after="0" w:line="240" w:lineRule="auto"/>
+              <w:jc w:val="left"/>
+            </w:pPr>
+            <w:r>
+              <w:rPr>
+                <w:color w:val="26313B"/>
+                <w:sz w:val="15"/>
+              </w:rPr>
+              <w:t>Data, rights, custody, registration, authorization, endpoint, identity, and completeness gates</w:t>
+            </w:r>
+          </w:p>
+        </w:tc>
+        <w:tc>
+          <w:tcPr>
+            <w:tcW w:type="dxa" w:w="1656"/>
+            <w:tcMar>
+              <w:top w:w="58" w:type="dxa"/>
+              <w:start w:w="72" w:type="dxa"/>
+              <w:bottom w:w="58" w:type="dxa"/>
+              <w:end w:w="72" w:type="dxa"/>
+            </w:tcMar>
+            <w:vAlign w:val="center"/>
+            <w:shd w:fill="F8FAFC" w:val="clear"/>
+          </w:tcPr>
+          <w:p>
+            <w:pPr>
+              <w:spacing w:after="0" w:line="240" w:lineRule="auto"/>
+              <w:jc w:val="left"/>
+            </w:pPr>
+            <w:r>
+              <w:rPr>
+                <w:color w:val="26313B"/>
+                <w:sz w:val="15"/>
+              </w:rPr>
+              <w:t>Not yet estimated</w:t>
+            </w:r>
+          </w:p>
+        </w:tc>
+        <w:tc>
+          <w:tcPr>
+            <w:tcW w:type="dxa" w:w="2304"/>
+            <w:tcMar>
+              <w:top w:w="58" w:type="dxa"/>
+              <w:start w:w="72" w:type="dxa"/>
+              <w:bottom w:w="58" w:type="dxa"/>
+              <w:end w:w="72" w:type="dxa"/>
+            </w:tcMar>
+            <w:vAlign w:val="center"/>
+            <w:shd w:fill="F8FAFC" w:val="clear"/>
+          </w:tcPr>
+          <w:p>
+            <w:pPr>
+              <w:spacing w:after="0" w:line="240" w:lineRule="auto"/>
+              <w:jc w:val="left"/>
+            </w:pPr>
+            <w:r>
+              <w:rPr>
+                <w:color w:val="26313B"/>
+                <w:sz w:val="15"/>
+              </w:rPr>
+              <w:t>No primary claim unless every gate passes</w:t>
+            </w:r>
+          </w:p>
+        </w:tc>
+      </w:tr>
+    </w:tbl>
+    <w:p>
+      <w:pPr>
+        <w:spacing w:after="0" w:before="0"/>
+      </w:pPr>
+    </w:p>
+    <w:p>
+      <w:pPr>
+        <w:pStyle w:val="Caption"/>
+      </w:pPr>
+      <w:r>
+        <w:rPr>
+          <w:b/>
+        </w:rPr>
+        <w:t>Table 5. Pre-specified exposure and support diagnostics</w:t>
+      </w:r>
+    </w:p>
+    <w:tbl>
+      <w:tblPr>
+        <w:tblW w:type="dxa" w:w="10080"/>
+        <w:jc w:val="center"/>
+        <w:tblLayout w:type="fixed"/>
+        <w:tblLook w:firstColumn="1" w:firstRow="1" w:lastColumn="0" w:lastRow="0" w:noHBand="0" w:noVBand="1" w:val="04A0"/>
+        <w:tblBorders>
+          <w:top w:val="single" w:sz="4" w:space="0" w:color="B8C5D3"/>
+          <w:left w:val="single" w:sz="4" w:space="0" w:color="B8C5D3"/>
+          <w:bottom w:val="single" w:sz="4" w:space="0" w:color="B8C5D3"/>
+          <w:right w:val="single" w:sz="4" w:space="0" w:color="B8C5D3"/>
+          <w:insideH w:val="single" w:sz="4" w:space="0" w:color="B8C5D3"/>
+          <w:insideV w:val="single" w:sz="4" w:space="0" w:color="B8C5D3"/>
+        </w:tblBorders>
+      </w:tblPr>
+      <w:tblGrid>
+        <w:gridCol w:w="2232"/>
+        <w:gridCol w:w="3960"/>
+        <w:gridCol w:w="1728"/>
+        <w:gridCol w:w="2160"/>
+      </w:tblGrid>
+      <w:tr>
+        <w:trPr>
+          <w:tblHeader w:val="true"/>
+          <w:cantSplit/>
+        </w:trPr>
+        <w:tc>
+          <w:tcPr>
+            <w:tcW w:type="dxa" w:w="2232"/>
+            <w:tcMar>
+              <w:top w:w="58" w:type="dxa"/>
+              <w:start w:w="72" w:type="dxa"/>
+              <w:bottom w:w="58" w:type="dxa"/>
+              <w:end w:w="72" w:type="dxa"/>
+            </w:tcMar>
+            <w:vAlign w:val="center"/>
+            <w:shd w:fill="E9EFF5" w:val="clear"/>
+          </w:tcPr>
+          <w:p>
+            <w:pPr>
+              <w:spacing w:after="0" w:line="240" w:lineRule="auto"/>
+              <w:jc w:val="left"/>
+            </w:pPr>
+            <w:r>
+              <w:rPr>
+                <w:b/>
+                <w:color w:val="0B2545"/>
+                <w:sz w:val="15"/>
+              </w:rPr>
+              <w:t>Diagnostic</w:t>
+            </w:r>
+          </w:p>
+        </w:tc>
+        <w:tc>
+          <w:tcPr>
+            <w:tcW w:type="dxa" w:w="3960"/>
+            <w:tcMar>
+              <w:top w:w="58" w:type="dxa"/>
+              <w:start w:w="72" w:type="dxa"/>
+              <w:bottom w:w="58" w:type="dxa"/>
+              <w:end w:w="72" w:type="dxa"/>
+            </w:tcMar>
+            <w:vAlign w:val="center"/>
+            <w:shd w:fill="E9EFF5" w:val="clear"/>
+          </w:tcPr>
+          <w:p>
+            <w:pPr>
+              <w:spacing w:after="0" w:line="240" w:lineRule="auto"/>
+              <w:jc w:val="left"/>
+            </w:pPr>
+            <w:r>
+              <w:rPr>
+                <w:b/>
+                <w:color w:val="0B2545"/>
+                <w:sz w:val="15"/>
+              </w:rPr>
+              <w:t>Registered scope</w:t>
+            </w:r>
+          </w:p>
+        </w:tc>
+        <w:tc>
+          <w:tcPr>
+            <w:tcW w:type="dxa" w:w="1728"/>
+            <w:tcMar>
+              <w:top w:w="58" w:type="dxa"/>
+              <w:start w:w="72" w:type="dxa"/>
+              <w:bottom w:w="58" w:type="dxa"/>
+              <w:end w:w="72" w:type="dxa"/>
+            </w:tcMar>
+            <w:vAlign w:val="center"/>
+            <w:shd w:fill="E9EFF5" w:val="clear"/>
+          </w:tcPr>
+          <w:p>
+            <w:pPr>
+              <w:spacing w:after="0" w:line="240" w:lineRule="auto"/>
+              <w:jc w:val="left"/>
+            </w:pPr>
+            <w:r>
+              <w:rPr>
+                <w:b/>
+                <w:color w:val="0B2545"/>
+                <w:sz w:val="15"/>
+              </w:rPr>
+              <w:t>Stage-2 result</w:t>
+            </w:r>
+          </w:p>
+        </w:tc>
+        <w:tc>
+          <w:tcPr>
+            <w:tcW w:type="dxa" w:w="2160"/>
+            <w:tcMar>
+              <w:top w:w="58" w:type="dxa"/>
+              <w:start w:w="72" w:type="dxa"/>
+              <w:bottom w:w="58" w:type="dxa"/>
+              <w:end w:w="72" w:type="dxa"/>
+            </w:tcMar>
+            <w:vAlign w:val="center"/>
+            <w:shd w:fill="E9EFF5" w:val="clear"/>
+          </w:tcPr>
+          <w:p>
+            <w:pPr>
+              <w:spacing w:after="0" w:line="240" w:lineRule="auto"/>
+              <w:jc w:val="left"/>
+            </w:pPr>
+            <w:r>
+              <w:rPr>
+                <w:b/>
+                <w:color w:val="0B2545"/>
+                <w:sz w:val="15"/>
+              </w:rPr>
+              <w:t>Inference</w:t>
+            </w:r>
+          </w:p>
+        </w:tc>
+      </w:tr>
+      <w:tr>
+        <w:trPr>
+          <w:cantSplit/>
+        </w:trPr>
+        <w:tc>
+          <w:tcPr>
+            <w:tcW w:type="dxa" w:w="2232"/>
+            <w:tcMar>
+              <w:top w:w="58" w:type="dxa"/>
+              <w:start w:w="72" w:type="dxa"/>
+              <w:bottom w:w="58" w:type="dxa"/>
+              <w:end w:w="72" w:type="dxa"/>
+            </w:tcMar>
+            <w:vAlign w:val="center"/>
+          </w:tcPr>
+          <w:p>
+            <w:pPr>
+              <w:spacing w:after="0" w:line="240" w:lineRule="auto"/>
+              <w:jc w:val="left"/>
+            </w:pPr>
+            <w:r>
+              <w:rPr>
+                <w:color w:val="26313B"/>
+                <w:sz w:val="15"/>
+              </w:rPr>
+              <w:t>Premature report-record share</w:t>
+            </w:r>
+          </w:p>
+        </w:tc>
+        <w:tc>
+          <w:tcPr>
+            <w:tcW w:type="dxa" w:w="3960"/>
+            <w:tcMar>
+              <w:top w:w="58" w:type="dxa"/>
+              <w:start w:w="72" w:type="dxa"/>
+              <w:bottom w:w="58" w:type="dxa"/>
+              <w:end w:w="72" w:type="dxa"/>
+            </w:tcMar>
+            <w:vAlign w:val="center"/>
+          </w:tcPr>
+          <w:p>
+            <w:pPr>
+              <w:spacing w:after="0" w:line="240" w:lineRule="auto"/>
+              <w:jc w:val="left"/>
+            </w:pPr>
+            <w:r>
+              <w:rPr>
+                <w:color w:val="26313B"/>
+                <w:sz w:val="15"/>
+              </w:rPr>
+              <w:t xml:space="preserve">Report-period-selected ROE records with </w:t>
+            </w:r>
+            <w:r>
+              <w:rPr>
+                <w:rFonts w:ascii="Courier New" w:hAnsi="Courier New"/>
+                <w:color w:val="26313B"/>
+                <w:sz w:val="14"/>
+              </w:rPr>
+              <w:t>publishDate &gt;= signal date</w:t>
+            </w:r>
+          </w:p>
+        </w:tc>
+        <w:tc>
+          <w:tcPr>
+            <w:tcW w:type="dxa" w:w="1728"/>
+            <w:tcMar>
+              <w:top w:w="58" w:type="dxa"/>
+              <w:start w:w="72" w:type="dxa"/>
+              <w:bottom w:w="58" w:type="dxa"/>
+              <w:end w:w="72" w:type="dxa"/>
+            </w:tcMar>
+            <w:vAlign w:val="center"/>
+          </w:tcPr>
+          <w:p>
+            <w:pPr>
+              <w:spacing w:after="0" w:line="240" w:lineRule="auto"/>
+              <w:jc w:val="left"/>
+            </w:pPr>
+            <w:r>
+              <w:rPr>
+                <w:color w:val="26313B"/>
+                <w:sz w:val="15"/>
+              </w:rPr>
+              <w:t>Not yet estimated</w:t>
+            </w:r>
+          </w:p>
+        </w:tc>
+        <w:tc>
+          <w:tcPr>
+            <w:tcW w:type="dxa" w:w="2160"/>
+            <w:tcMar>
+              <w:top w:w="58" w:type="dxa"/>
+              <w:start w:w="72" w:type="dxa"/>
+              <w:bottom w:w="58" w:type="dxa"/>
+              <w:end w:w="72" w:type="dxa"/>
+            </w:tcMar>
+            <w:vAlign w:val="center"/>
+          </w:tcPr>
+          <w:p>
+            <w:pPr>
+              <w:spacing w:after="0" w:line="240" w:lineRule="auto"/>
+              <w:jc w:val="left"/>
+            </w:pPr>
+            <w:r>
+              <w:rPr>
+                <w:color w:val="26313B"/>
+                <w:sz w:val="15"/>
+              </w:rPr>
+              <w:t>Descriptive; no forward return</w:t>
+            </w:r>
+          </w:p>
+        </w:tc>
+      </w:tr>
+      <w:tr>
+        <w:trPr>
+          <w:cantSplit/>
+        </w:trPr>
+        <w:tc>
+          <w:tcPr>
+            <w:tcW w:type="dxa" w:w="2232"/>
+            <w:tcMar>
+              <w:top w:w="58" w:type="dxa"/>
+              <w:start w:w="72" w:type="dxa"/>
+              <w:bottom w:w="58" w:type="dxa"/>
+              <w:end w:w="72" w:type="dxa"/>
+            </w:tcMar>
+            <w:vAlign w:val="center"/>
+            <w:shd w:fill="F8FAFC" w:val="clear"/>
+          </w:tcPr>
+          <w:p>
+            <w:pPr>
+              <w:spacing w:after="0" w:line="240" w:lineRule="auto"/>
+              <w:jc w:val="left"/>
+            </w:pPr>
+            <w:r>
+              <w:rPr>
+                <w:color w:val="26313B"/>
+                <w:sz w:val="15"/>
+              </w:rPr>
+              <w:t>Changed report-period share</w:t>
+            </w:r>
+          </w:p>
+        </w:tc>
+        <w:tc>
+          <w:tcPr>
+            <w:tcW w:type="dxa" w:w="3960"/>
+            <w:tcMar>
+              <w:top w:w="58" w:type="dxa"/>
+              <w:start w:w="72" w:type="dxa"/>
+              <w:bottom w:w="58" w:type="dxa"/>
+              <w:end w:w="72" w:type="dxa"/>
+            </w:tcMar>
+            <w:vAlign w:val="center"/>
+            <w:shd w:fill="F8FAFC" w:val="clear"/>
+          </w:tcPr>
+          <w:p>
+            <w:pPr>
+              <w:spacing w:after="0" w:line="240" w:lineRule="auto"/>
+              <w:jc w:val="left"/>
+            </w:pPr>
+            <w:r>
+              <w:rPr>
+                <w:color w:val="26313B"/>
+                <w:sz w:val="15"/>
+              </w:rPr>
+              <w:t>Common-support securities selecting different report periods under the two clocks</w:t>
+            </w:r>
+          </w:p>
+        </w:tc>
+        <w:tc>
+          <w:tcPr>
+            <w:tcW w:type="dxa" w:w="1728"/>
+            <w:tcMar>
+              <w:top w:w="58" w:type="dxa"/>
+              <w:start w:w="72" w:type="dxa"/>
+              <w:bottom w:w="58" w:type="dxa"/>
+              <w:end w:w="72" w:type="dxa"/>
+            </w:tcMar>
+            <w:vAlign w:val="center"/>
+            <w:shd w:fill="F8FAFC" w:val="clear"/>
+          </w:tcPr>
+          <w:p>
+            <w:pPr>
+              <w:spacing w:after="0" w:line="240" w:lineRule="auto"/>
+              <w:jc w:val="left"/>
+            </w:pPr>
+            <w:r>
+              <w:rPr>
+                <w:color w:val="26313B"/>
+                <w:sz w:val="15"/>
+              </w:rPr>
+              <w:t>Not yet estimated</w:t>
+            </w:r>
+          </w:p>
+        </w:tc>
+        <w:tc>
+          <w:tcPr>
+            <w:tcW w:type="dxa" w:w="2160"/>
+            <w:tcMar>
+              <w:top w:w="58" w:type="dxa"/>
+              <w:start w:w="72" w:type="dxa"/>
+              <w:bottom w:w="58" w:type="dxa"/>
+              <w:end w:w="72" w:type="dxa"/>
+            </w:tcMar>
+            <w:vAlign w:val="center"/>
+            <w:shd w:fill="F8FAFC" w:val="clear"/>
+          </w:tcPr>
+          <w:p>
+            <w:pPr>
+              <w:spacing w:after="0" w:line="240" w:lineRule="auto"/>
+              <w:jc w:val="left"/>
+            </w:pPr>
+            <w:r>
+              <w:rPr>
+                <w:color w:val="26313B"/>
+                <w:sz w:val="15"/>
+              </w:rPr>
+              <w:t>Descriptive; no forward return</w:t>
+            </w:r>
+          </w:p>
+        </w:tc>
+      </w:tr>
+      <w:tr>
+        <w:trPr>
+          <w:cantSplit/>
+        </w:trPr>
+        <w:tc>
+          <w:tcPr>
+            <w:tcW w:type="dxa" w:w="2232"/>
+            <w:tcMar>
+              <w:top w:w="58" w:type="dxa"/>
+              <w:start w:w="72" w:type="dxa"/>
+              <w:bottom w:w="58" w:type="dxa"/>
+              <w:end w:w="72" w:type="dxa"/>
+            </w:tcMar>
+            <w:vAlign w:val="center"/>
+          </w:tcPr>
+          <w:p>
+            <w:pPr>
+              <w:spacing w:after="0" w:line="240" w:lineRule="auto"/>
+              <w:jc w:val="left"/>
+            </w:pPr>
+            <w:r>
+              <w:rPr>
+                <w:color w:val="26313B"/>
+                <w:sz w:val="15"/>
+              </w:rPr>
+              <w:t>Reporting-delay distribution</w:t>
+            </w:r>
+          </w:p>
+        </w:tc>
+        <w:tc>
+          <w:tcPr>
+            <w:tcW w:type="dxa" w:w="3960"/>
+            <w:tcMar>
+              <w:top w:w="58" w:type="dxa"/>
+              <w:start w:w="72" w:type="dxa"/>
+              <w:bottom w:w="58" w:type="dxa"/>
+              <w:end w:w="72" w:type="dxa"/>
+            </w:tcMar>
+            <w:vAlign w:val="center"/>
+          </w:tcPr>
+          <w:p>
+            <w:pPr>
+              <w:spacing w:after="0" w:line="240" w:lineRule="auto"/>
+              <w:jc w:val="left"/>
+            </w:pPr>
+            <w:r>
+              <w:rPr>
+                <w:color w:val="26313B"/>
+                <w:sz w:val="15"/>
+              </w:rPr>
+              <w:t>Count, mean, median, p25, p75, and maximum calendar days</w:t>
+            </w:r>
+          </w:p>
+        </w:tc>
+        <w:tc>
+          <w:tcPr>
+            <w:tcW w:type="dxa" w:w="1728"/>
+            <w:tcMar>
+              <w:top w:w="58" w:type="dxa"/>
+              <w:start w:w="72" w:type="dxa"/>
+              <w:bottom w:w="58" w:type="dxa"/>
+              <w:end w:w="72" w:type="dxa"/>
+            </w:tcMar>
+            <w:vAlign w:val="center"/>
+          </w:tcPr>
+          <w:p>
+            <w:pPr>
+              <w:spacing w:after="0" w:line="240" w:lineRule="auto"/>
+              <w:jc w:val="left"/>
+            </w:pPr>
+            <w:r>
+              <w:rPr>
+                <w:color w:val="26313B"/>
+                <w:sz w:val="15"/>
+              </w:rPr>
+              <w:t>Not yet estimated</w:t>
+            </w:r>
+          </w:p>
+        </w:tc>
+        <w:tc>
+          <w:tcPr>
+            <w:tcW w:type="dxa" w:w="2160"/>
+            <w:tcMar>
+              <w:top w:w="58" w:type="dxa"/>
+              <w:start w:w="72" w:type="dxa"/>
+              <w:bottom w:w="58" w:type="dxa"/>
+              <w:end w:w="72" w:type="dxa"/>
+            </w:tcMar>
+            <w:vAlign w:val="center"/>
+          </w:tcPr>
+          <w:p>
+            <w:pPr>
+              <w:spacing w:after="0" w:line="240" w:lineRule="auto"/>
+              <w:jc w:val="left"/>
+            </w:pPr>
+            <w:r>
+              <w:rPr>
+                <w:color w:val="26313B"/>
+                <w:sz w:val="15"/>
+              </w:rPr>
+              <w:t>Descriptive; no forward return</w:t>
+            </w:r>
+          </w:p>
+        </w:tc>
+      </w:tr>
+      <w:tr>
+        <w:trPr>
+          <w:cantSplit/>
+        </w:trPr>
+        <w:tc>
+          <w:tcPr>
+            <w:tcW w:type="dxa" w:w="2232"/>
+            <w:tcMar>
+              <w:top w:w="58" w:type="dxa"/>
+              <w:start w:w="72" w:type="dxa"/>
+              <w:bottom w:w="58" w:type="dxa"/>
+              <w:end w:w="72" w:type="dxa"/>
+            </w:tcMar>
+            <w:vAlign w:val="center"/>
+            <w:shd w:fill="F8FAFC" w:val="clear"/>
+          </w:tcPr>
+          <w:p>
+            <w:pPr>
+              <w:spacing w:after="0" w:line="240" w:lineRule="auto"/>
+              <w:jc w:val="left"/>
+            </w:pPr>
+            <w:r>
+              <w:rPr>
+                <w:color w:val="26313B"/>
+                <w:sz w:val="15"/>
+              </w:rPr>
+              <w:t>Signal-support counts</w:t>
+            </w:r>
+          </w:p>
+        </w:tc>
+        <w:tc>
+          <w:tcPr>
+            <w:tcW w:type="dxa" w:w="3960"/>
+            <w:tcMar>
+              <w:top w:w="58" w:type="dxa"/>
+              <w:start w:w="72" w:type="dxa"/>
+              <w:bottom w:w="58" w:type="dxa"/>
+              <w:end w:w="72" w:type="dxa"/>
+            </w:tcMar>
+            <w:vAlign w:val="center"/>
+            <w:shd w:fill="F8FAFC" w:val="clear"/>
+          </w:tcPr>
+          <w:p>
+            <w:pPr>
+              <w:spacing w:after="0" w:line="240" w:lineRule="auto"/>
+              <w:jc w:val="left"/>
+            </w:pPr>
+            <w:r>
+              <w:rPr>
+                <w:color w:val="26313B"/>
+                <w:sz w:val="15"/>
+              </w:rPr>
+              <w:t>Report, publication, common, report-only, and publication-only support</w:t>
+            </w:r>
+          </w:p>
+        </w:tc>
+        <w:tc>
+          <w:tcPr>
+            <w:tcW w:type="dxa" w:w="1728"/>
+            <w:tcMar>
+              <w:top w:w="58" w:type="dxa"/>
+              <w:start w:w="72" w:type="dxa"/>
+              <w:bottom w:w="58" w:type="dxa"/>
+              <w:end w:w="72" w:type="dxa"/>
+            </w:tcMar>
+            <w:vAlign w:val="center"/>
+            <w:shd w:fill="F8FAFC" w:val="clear"/>
+          </w:tcPr>
+          <w:p>
+            <w:pPr>
+              <w:spacing w:after="0" w:line="240" w:lineRule="auto"/>
+              <w:jc w:val="left"/>
+            </w:pPr>
+            <w:r>
+              <w:rPr>
+                <w:color w:val="26313B"/>
+                <w:sz w:val="15"/>
+              </w:rPr>
+              <w:t>Not yet estimated</w:t>
+            </w:r>
+          </w:p>
+        </w:tc>
+        <w:tc>
+          <w:tcPr>
+            <w:tcW w:type="dxa" w:w="2160"/>
+            <w:tcMar>
+              <w:top w:w="58" w:type="dxa"/>
+              <w:start w:w="72" w:type="dxa"/>
+              <w:bottom w:w="58" w:type="dxa"/>
+              <w:end w:w="72" w:type="dxa"/>
+            </w:tcMar>
+            <w:vAlign w:val="center"/>
+            <w:shd w:fill="F8FAFC" w:val="clear"/>
+          </w:tcPr>
+          <w:p>
+            <w:pPr>
+              <w:spacing w:after="0" w:line="240" w:lineRule="auto"/>
+              <w:jc w:val="left"/>
+            </w:pPr>
+            <w:r>
+              <w:rPr>
+                <w:color w:val="26313B"/>
+                <w:sz w:val="15"/>
+              </w:rPr>
+              <w:t>Descriptive support accounting</w:t>
+            </w:r>
+          </w:p>
+        </w:tc>
+      </w:tr>
+      <w:tr>
+        <w:trPr>
+          <w:cantSplit/>
+        </w:trPr>
+        <w:tc>
+          <w:tcPr>
+            <w:tcW w:type="dxa" w:w="2232"/>
+            <w:tcMar>
+              <w:top w:w="58" w:type="dxa"/>
+              <w:start w:w="72" w:type="dxa"/>
+              <w:bottom w:w="58" w:type="dxa"/>
+              <w:end w:w="72" w:type="dxa"/>
+            </w:tcMar>
+            <w:vAlign w:val="center"/>
+          </w:tcPr>
+          <w:p>
+            <w:pPr>
+              <w:spacing w:after="0" w:line="240" w:lineRule="auto"/>
+              <w:jc w:val="left"/>
+            </w:pPr>
+            <w:r>
+              <w:rPr>
+                <w:color w:val="26313B"/>
+                <w:sz w:val="15"/>
+              </w:rPr>
+              <w:t>Endpoint resolution</w:t>
+            </w:r>
+          </w:p>
+        </w:tc>
+        <w:tc>
+          <w:tcPr>
+            <w:tcW w:type="dxa" w:w="3960"/>
+            <w:tcMar>
+              <w:top w:w="58" w:type="dxa"/>
+              <w:start w:w="72" w:type="dxa"/>
+              <w:bottom w:w="58" w:type="dxa"/>
+              <w:end w:w="72" w:type="dxa"/>
+            </w:tcMar>
+            <w:vAlign w:val="center"/>
+          </w:tcPr>
+          <w:p>
+            <w:pPr>
+              <w:spacing w:after="0" w:line="240" w:lineRule="auto"/>
+              <w:jc w:val="left"/>
+            </w:pPr>
+            <w:r>
+              <w:rPr>
+                <w:color w:val="26313B"/>
+                <w:sz w:val="15"/>
+              </w:rPr>
+              <w:t>Candidate, eligible, exact-resolved, and three registered unresolved reason counts</w:t>
+            </w:r>
+          </w:p>
+        </w:tc>
+        <w:tc>
+          <w:tcPr>
+            <w:tcW w:type="dxa" w:w="1728"/>
+            <w:tcMar>
+              <w:top w:w="58" w:type="dxa"/>
+              <w:start w:w="72" w:type="dxa"/>
+              <w:bottom w:w="58" w:type="dxa"/>
+              <w:end w:w="72" w:type="dxa"/>
+            </w:tcMar>
+            <w:vAlign w:val="center"/>
+          </w:tcPr>
+          <w:p>
+            <w:pPr>
+              <w:spacing w:after="0" w:line="240" w:lineRule="auto"/>
+              <w:jc w:val="left"/>
+            </w:pPr>
+            <w:r>
+              <w:rPr>
+                <w:color w:val="26313B"/>
+                <w:sz w:val="15"/>
+              </w:rPr>
+              <w:t>Not yet estimated</w:t>
+            </w:r>
+          </w:p>
+        </w:tc>
+        <w:tc>
+          <w:tcPr>
+            <w:tcW w:type="dxa" w:w="2160"/>
+            <w:tcMar>
+              <w:top w:w="58" w:type="dxa"/>
+              <w:start w:w="72" w:type="dxa"/>
+              <w:bottom w:w="58" w:type="dxa"/>
+              <w:end w:w="72" w:type="dxa"/>
+            </w:tcMar>
+            <w:vAlign w:val="center"/>
+          </w:tcPr>
+          <w:p>
+            <w:pPr>
+              <w:spacing w:after="0" w:line="240" w:lineRule="auto"/>
+              <w:jc w:val="left"/>
+            </w:pPr>
+            <w:r>
+              <w:rPr>
+                <w:color w:val="26313B"/>
+                <w:sz w:val="15"/>
+              </w:rPr>
+              <w:t>Global completeness gate</w:t>
+            </w:r>
+          </w:p>
+        </w:tc>
+      </w:tr>
+    </w:tbl>
+    <w:p>
+      <w:pPr>
+        <w:spacing w:after="0" w:before="0"/>
+      </w:pPr>
     </w:p>
     <w:p>
       <w:pPr>
@@ -10696,15 +12324,12 @@
       <w:pStyle w:val="Header"/>
       <w:spacing w:after="0"/>
       <w:jc w:val="left"/>
-      <w:pBdr>
-        <w:bottom w:val="single" w:sz="4" w:space="5" w:color="B8C5D3"/>
-      </w:pBdr>
     </w:pPr>
     <w:r>
       <w:rPr>
         <w:rFonts w:ascii="Calibri" w:hAnsi="Calibri"/>
         <w:b/>
-        <w:color w:val="5A6573"/>
+        <w:color w:val="000000"/>
         <w:sz w:val="15"/>
       </w:rPr>
       <w:t>PRE-RESULTS PROTOCOL   |   A-SHARE ROE INFORMATION TIMING</w:t>
@@ -11227,7 +12852,7 @@
       <w:b/>
       <w:bCs/>
       <w:i w:val="0"/>
-      <w:color w:val="2E74B5"/>
+      <w:color w:val="000000"/>
       <w:sz w:val="27"/>
       <w:szCs w:val="28"/>
     </w:rPr>
@@ -11252,7 +12877,7 @@
       <w:b/>
       <w:bCs/>
       <w:i w:val="0"/>
-      <w:color w:val="2E74B5"/>
+      <w:color w:val="000000"/>
       <w:sz w:val="22"/>
       <w:szCs w:val="26"/>
     </w:rPr>
@@ -11277,7 +12902,7 @@
       <w:b/>
       <w:bCs/>
       <w:i w:val="0"/>
-      <w:color w:val="2E74B5"/>
+      <w:color w:val="000000"/>
       <w:sz w:val="20"/>
     </w:rPr>
   </w:style>
@@ -11521,7 +13146,7 @@
       <w:rFonts w:asciiTheme="majorHAnsi" w:eastAsiaTheme="majorEastAsia" w:hAnsiTheme="majorHAnsi" w:cstheme="majorBidi" w:ascii="Calibri" w:hAnsi="Calibri"/>
       <w:b/>
       <w:i w:val="0"/>
-      <w:color w:val="0B2545"/>
+      <w:color w:val="000000"/>
       <w:spacing w:val="5"/>
       <w:kern w:val="28"/>
       <w:sz w:val="50"/>
@@ -11564,7 +13189,7 @@
       <w:b w:val="0"/>
       <w:i w:val="0"/>
       <w:iCs/>
-      <w:color w:val="1F4D78"/>
+      <w:color w:val="000000"/>
       <w:spacing w:val="15"/>
       <w:sz w:val="28"/>
       <w:szCs w:val="24"/>
@@ -11982,7 +13607,7 @@
       <w:rFonts w:ascii="Calibri" w:hAnsi="Calibri"/>
       <w:b/>
       <w:bCs/>
-      <w:color w:val="4F81BD"/>
+      <w:color w:val="000000"/>
       <w:sz w:val="17"/>
       <w:szCs w:val="18"/>
     </w:rPr>
@@ -22881,7 +24506,7 @@
       <w:rFonts w:ascii="Calibri" w:hAnsi="Calibri"/>
       <w:b/>
       <w:i w:val="0"/>
-      <w:color w:val="4F81BD"/>
+      <w:color w:val="000000"/>
       <w:sz w:val="19"/>
     </w:rPr>
   </w:style>

</xml_diff>